<commit_message>
Update whitepaper to July DDM-gate revision (md/pdf/docx); de-commercialize SUPPORT
</commit_message>
<xml_diff>
--- a/whitepaper.docx
+++ b/whitepaper.docx
@@ -178,7 +178,7 @@
         <w:jc w:val="both"/>
       </w:pPr>
       <w:r>
-        <w:t xml:space="preserve">We independently reimplement the compressed likelihoods behind the DESI DR2 preference for evolving dark energy (w₀wₐCDM over ΛCDM) and subject the result to influence diagnostics, calibration stress tests, parameterization swaps, parametric bootstraps, a comparator-measurement swap test, full-Boltzmann (CAMB) verification, and posterior sampling under the collaboration's own priors. We reproduce the published Δχ²_MAP ladder (−4.7/−4.9/−8.0 published vs −4.7/−5.1/−8.5 here), marginalized posteriors (w₀ = −0.45 +0.24/−0.23, wₐ = −1.66 +0.65/−0.71 vs published −0.42 ± 0.21, −1.75 ± 0.58), the w₀–wₐ posterior correlation (−0.978 vs −0.975), and ΔDIC (−4.96 vs −4.4). We then find the preference is sharply localized. Removing the single LRG2 (z = 0.706) BAO measurement collapses the compressed-CMB preference from 2.4σ to 1.6σ (full CAMB: 2.41σ → 1.53σ). Substituting the earlier eBOSS DR16 measurement at the same redshift — a lower-precision, partially sample- and footprint-correlated comparator, not an independent experiment — yields a preference identical to having no measurement there. The z ≈ 0.7 anomaly changed observable between DESI's releases — transverse (D_M) in DR1, radial (D_H) in DR2. A selection-calibrated test repeats all seven tracer deletions inside each of 5,000 ΛCDM mocks. The observed maximum loss of preference is M = 4.125 in Δχ², at LRG2; 78/5,000 null mocks have an equal-or-larger selected maximum, p = 0.0156 [0.0124, 0.0194]. However, among the 70 null mocks whose global w₀wₐ preference is at least as strong as observed, 34 have an equal-or-larger maximum, p_cond = 0.486 [0.364, 0.608]. LRG2 is therefore descriptively load-bearing, but the concentration is not exceptional conditional on a global fluctuation of this strength. A held-out ΛCDM fit predicts LRG2 at joint p = 0.0408 (2.05σ); the discrepancy is mainly in the isotropic distance D_V/r_d (p = 0.0204), while the Alcock–Paczynski ratio is ordinary (p = 0.374). On the supernova side, a single free magnitude offset on the DES5Y external low-z sample fits at +0.036 mag and reduces the DESI+DES5Y preference from 2.2σ to 0.2σ (1.3σ with the CMB anchor); this is a degeneracy test, not a calibration diagnosis. Evolving families outperform constant w, but the direct question is calibrated separately: in DESI+cCMB, CPL w₀wₐCDM improves over wCDM by T = 7.851, with 30/5,000 constant-w mocks as large, p = 0.0060 [0.0041, 0.0086] (2.75σ). Removing LRG2 reduces this direct time-variation test to T = 3.426, p = 0.0698 [0.0629, 0.0772] (1.81σ). A separate global ΛCDM bootstrap gives p = 0.0140 [0.0109, 0.0177], consistent with Wilks. A pre-registered cross-probe consistency test returned an INTERMEDIATE verdict. Finally, a full-CMB variant including lensing (PR3-native likelihoods) gives Δχ² = −10.35 (2.77σ) with LRG2 and −3.76 (1.43σ) without it. We conclude that the compressed likelihood contains a calibrated, CPL-specific hint of time variation, but its strength remains LRG2-sensitive and the selected localization is ordinary among equally strong ΛCDM fluctuations. A hint, precisely mapped; not a discovery.</w:t>
+        <w:t xml:space="preserve">We independently reimplement the compressed likelihoods behind the DESI DR2 preference for evolving dark energy (w₀wₐCDM over ΛCDM) and subject the result to influence diagnostics, calibration stress tests, parameterization swaps, parametric bootstraps, a comparator-measurement swap test, full-Boltzmann (CAMB) verification, and posterior sampling under the collaboration's own priors. We reproduce the published Δχ²_MAP ladder (−4.7/−4.9/−8.0 published vs −4.7/−5.1/−8.5 here), marginalized posteriors (w₀ = −0.45 +0.24/−0.23, wₐ = −1.66 +0.65/−0.71 vs published −0.42 ± 0.21, −1.75 ± 0.58), the w₀–wₐ posterior correlation (−0.978 vs −0.975), and ΔDIC (−4.96 vs −4.4). We then find the preference is sharply localized. Removing the single LRG2 (z = 0.706) BAO measurement collapses the compressed-CMB preference from 2.4σ to 1.6σ (full CAMB: 2.41σ → 1.53σ). Substituting the earlier eBOSS DR16 measurement at the same redshift — a lower-precision, partially sample- and footprint-correlated comparator, not an independent experiment — yields a preference identical to having no measurement there. The z ≈ 0.7 anomaly changed observable between DESI's releases — transverse (D_M) in DR1, radial (D_H) in DR2. A selection-calibrated test repeats all seven tracer deletions inside each of 5,000 ΛCDM mocks. The observed maximum loss of preference is M = 4.125 in Δχ², at LRG2; 78/5,000 null mocks have an equal-or-larger selected maximum, p = 0.0156 [0.0124, 0.0194]. However, among the 70 null mocks whose global w₀wₐ preference is at least as strong as observed, 34 have an equal-or-larger maximum, p_cond = 0.486 [0.364, 0.608]. LRG2 is therefore descriptively load-bearing, but the concentration is not exceptional conditional on a global fluctuation of this strength. A held-out ΛCDM fit predicts LRG2 at joint p = 0.0408 (2.05σ); the discrepancy is mainly in the isotropic distance D_V/r_d (p = 0.0204), while the Alcock–Paczynski ratio is ordinary (p = 0.374). On the supernova side, a single free magnitude offset on the DES5Y external low-z sample fits at +0.036 mag and reduces the DESI+DES5Y preference from 2.2σ to 0.2σ (1.3σ with the CMB anchor); this is a degeneracy test, not a calibration diagnosis. Evolving families outperform constant w, but the direct question is calibrated separately: in DESI+cCMB, CPL w₀wₐCDM improves over wCDM by T = 7.851, with 30/5,000 constant-w mocks as large, p = 0.0060 [0.0041, 0.0086] (2.75σ). Removing LRG2 reduces this direct time-variation test to T = 3.426, p = 0.0698 [0.0629, 0.0772] (1.81σ). A separate global ΛCDM bootstrap gives p = 0.0140 [0.0109, 0.0177], consistent with Wilks. A pre-registered cross-probe consistency test returned an INTERMEDIATE verdict. Finally, a full-CMB variant including lensing (PR3-native likelihoods) gives Δχ² = −10.35 (2.77σ) with LRG2 and −3.76 (1.43σ) without it. We also gate the July 2026 dynamical-dark-matter reinterpretation. Its exact background gives Δχ² = −5.861 on the same DESI+cCMB geometry data, but 354/5,000 ΛCDM mocks do at least as well (p = 0.0708); CPL fits better, the DDM optimum lies on its equation-of-state prior wall, and LRG2 removal reduces the statistic to 3.461. Repeating all seven DDM deletions inside the 354 equally strong global null mocks gives 216 equal-or-larger selected influences, p_cond = 0.610 [0.557, 0.661], so its localization is ordinary conditional on the global fluctuation. In DESI+cCMB+DES5Y, a matched non-regular bootstrap gives p=0.0122 [0.00934,0.01564], but a separately calibrated low-z-offset branch gives p=0.0934 [0.0855,0.1018]. An independent CLASS implementation of the published linear perturbations passes exact-CDM controls, reproduces the reported low S₈, and then places the two published mean vectors under substantial pressure from a public SDSS DR16 compressed full-shape/growth vector (fixed-vector full p=0.0128 and 0.00181; growth-only p=0.00302 and 0.000368). Native nonlinear full-shape and lensing likelihood refits remain open. We conclude that the compressed likelihood contains a calibrated, CPL-specific hint of time variation, but neither it nor the DDM reinterpretation constitutes a discovery. A hint, precisely mapped.</w:t>
       </w:r>
     </w:p>
     <w:p>
@@ -1321,7 +1321,7 @@
         <w:keepNext/>
       </w:pPr>
       <w:r>
-        <w:t xml:space="preserve">9. What this establishes — and what it does not</w:t>
+        <w:t xml:space="preserve">9. July 2026 dynamical-dark-matter gate</w:t>
       </w:r>
     </w:p>
     <w:p>
@@ -1330,14 +1330,71 @@
         <w:jc w:val="both"/>
       </w:pPr>
       <w:r>
-        <w:t xml:space="preserve">Established: the published compressed likelihoods genuinely contain the reported preference; it survives independent reimplementation, optimizer attack, full Boltzmann physics, parameterization changes, and bootstrap calibration. Within CPL, a direct constant-w null test gives a calibrated 2.75σ preference for time variation, falling to 1.81σ without LRG2. The held-out LRG2 vector is a modest 2.05σ discrepancy, driven more by isotropic distance scale than by its shape ratio. Among ΛCDM mocks with a global preference this strong, a maximum deletion influence at least as large as observed occurs about half the time. Not established: that dark energy evolves; that LRG2 is wrong; that localization or the targeted held-out p-value is independent evidence; that the supernova calibration explanation is correct; or that the PR3-native full-CMB variant reproduces DESI's PR4/ACT stack. The honest status is </w:t>
+        <w:t xml:space="preserve">After Ajith and Kumar proposed that the DESI preference could arise from a dark-matter equation of state that changes from an early asymptote wₐᵈᵐ to a late asymptote w₀ᵈᵐ, we independently derived and implemented their exact homogeneous density evolution. The CDM null is recovered exactly. On DESI+cCMB, the geometry screen gives Δχ²_DDM−Λ = −5.861, within 0.697 of their −6.558 result on a different, full-CMB likelihood stack. This is a successful background-level reproduction, not a reproduction of their unpublished modified-CAMB perturbation implementation.</w:t>
+      </w:r>
+    </w:p>
+    <w:p>
+      <w:pPr>
+        <w:widowControl/>
+        <w:jc w:val="both"/>
+      </w:pPr>
+      <w:r>
+        <w:t xml:space="preserve">The identical-data comparison does not select DDM. The minimum χ² values are 15.578 (ΛCDM), 14.971 (constant-w), 7.120 (CPL), and 9.717 (DDM); descriptive AIC values are 21.578, 22.971, 17.120, and 21.717, respectively. CPL fits DDM better by 2.596 in χ². The DDM optimum has Ωm = 0.3546, h = 0.6821, wₐᵈᵐ = 0.001278, a_t = 0.551, and w₀ᵈᵐ = −0.1000 — exactly the source prior's lower wall. Repeating the fit with ±0.05, ±0.10, and ±0.20 EoS boxes moves the optimum to −0.05, −0.10, and −0.20 while T changes only 5.681 → 5.861 → 6.024. The raw fit improvement is fairly stable, but the inferred late-time EoS is not a prior-stable measurement.</w:t>
+      </w:r>
+    </w:p>
+    <w:p>
+      <w:pPr>
+        <w:widowControl/>
+        <w:jc w:val="both"/>
+      </w:pPr>
+      <w:r>
+        <w:t xml:space="preserve">Because a_t is unidentified when w₀ᵈᵐ = wₐᵈᵐ = 0, Wilks' theorem is not used. Repeating the complete DDM search in 5,000 fitted-ΛCDM mocks gives 354 values at least as large as T_obs = 5.861: p = 0.0708 [0.0638, 0.0783], equivalent to 1.47σ one-sided or 1.81σ under a two-sided convention. All final fits converged; 3,219/5,000 null fits reached a source-prior boundary. Across the seven observed tracer deletions, only LRG2 weakens DDM materially: T = 3.461, a loss of 2.400, while all six other deletions slightly strengthen it. This is less concentrated than CPL's 4.125 loss, but it points in the same pre-identified direction. The matched no-LRG2 bootstrap gives 1,139/5,000, p = 0.2278 [0.2162, 0.2397] (0.75σ one-sided; 1.21σ two-sided). To calibrate selection, all seven deletions were then repeated inside every one of the 354 null mocks whose global DDM statistic was at least as large as observed. Of those, 216 have a selected maximum influence at least as large as LRG2's 2.400: p_cond = 0.6102 [0.5572, 0.6613]. The null median maximum is 2.851, larger than observed, and LRG2 is selected in only 22/354 mocks. LRG2 was a registered target before this DDM analysis, but the calibrated result is stronger: its observed leverage is not exceptional conditional on the global fluctuation.</w:t>
+      </w:r>
+    </w:p>
+    <w:p>
+      <w:pPr>
+        <w:widowControl/>
+        <w:jc w:val="both"/>
+      </w:pPr>
+      <w:r>
+        <w:t xml:space="preserve">The low-redshift supernova seam also matters without fully absorbing DDM. On the 2025 Dovekie DES5Y release, DESI+cCMB+DES5Y gives T_DDM = 9.603. Because a_t is unidentified under ΛCDM, a matched 5,000-mock bootstrap—not Wilks—sets the significance: 61/5,000 mocks are equal or larger, p=0.0122 [0.00934,0.01564] (2.25σ one-sided). Freeing one offset for the external low-z sample fits +0.0315 mag and reduces T to 5.358. A second bootstrap uses that branch's own fitted ΛCDM null and identical nuisance projection: 467/5,000, p=0.0934 [0.0855,0.1018] (1.32σ one-sided). Both runs had zero optimizer failures. Counting the magnitude nuisances, all four offset models fall within 1.45 descriptive AIC units and ΛCDM has the lowest value. The calibration freedom therefore moves the DDM preference from an interesting combined-data hint to a statistically ordinary result. This establishes dependence on the calibration model, not that the calibration is wrong.</w:t>
+      </w:r>
+    </w:p>
+    <w:p>
+      <w:pPr>
+        <w:widowControl/>
+        <w:jc w:val="both"/>
+      </w:pPr>
+      <w:r>
+        <w:t xml:space="preserve">The physical-growth gate is not passed. Because the source's modified CAMB code is unavailable, we independently patched pinned public CLASS v3.3.4 with the published synchronous-gauge, zero-sound-speed, zero-shear fluid equations. Exact-CDM nesting agrees with stock CLASS to 2.8×10⁻⁵ in σ₈, 2.5×10⁻⁴ in linear P(k), and 1.4×10⁻⁴ in CMB lensing; a tighter-integration rerun is stable. The source CMB+DESI+DESY5 and +G17 mean vectors reproduce (σ₈,S₈)=(0.728,0.793) and (0.708,0.775), close to the paper. Against the public correlated SDSS DR16 compressed (D_M/r_d,D_H/r_d,fσ₈) vector, however, the fixed source vectors give χ²=20.97/9 (p=0.0128) and 26.32/9 (p=0.00181), with growth-only χ²=13.92/3 (p=0.00302) and 18.37/3 (p=0.000368). Matched ΛCDM controls give full-vector p=0.162 and 0.096. Profiling only primordial amplitude can repair the growth residuals, but requires σ₈=0.918 or 0.931 and a 33–39-source-error shift in ln(10¹⁰A_s), eliminating the proposed low-growth benefit. Linear CMB-lensing power is suppressed to 0.87/0.79 and 0.85/0.76 of matched ΛCDM at low/high multipoles, a prediction rather than a likelihood result.</w:t>
+      </w:r>
+    </w:p>
+    <w:p>
+      <w:pPr>
+        <w:widowControl/>
+        <w:jc w:val="left"/>
+      </w:pPr>
+      <w:r>
+        <w:t xml:space="preserve">These are independently reproducible equation-level and fixed-vector tests, not a native nonlinear DESI full-shape/EFT refit or an ACT/Planck/weak-lensing likelihood evaluation. SDSS partly overlaps DESI, and cosmological and galaxy-bias parameters were not reoptimized. The result is therefore substantial falsification pressure, not a formal model-family exclusion. The complete source-audited gate is </w:t>
+      </w:r>
+      <w:r>
+        <w:rPr>
+          <w:rFonts w:ascii="Courier New" w:cs="Courier New" w:eastAsia="Courier New" w:hAnsi="Courier New"/>
+          <w:color w:val="334155"/>
+          <w:sz w:val="18"/>
+          <w:szCs w:val="18"/>
+        </w:rPr>
+        <w:t xml:space="preserve">DDM_FRONTIER_GATE.md</w:t>
+      </w:r>
+      <w:r>
+        <w:t xml:space="preserve">. </w:t>
       </w:r>
       <w:r>
         <w:rPr>
           <w:b/>
           <w:bCs/>
         </w:rPr>
-        <w:t xml:space="preserve">a reproducible, LRG2-sensitive 2–3σ hint — not proof.</w:t>
+        <w:t xml:space="preserve">Canonical verdict: the DDM background is a reproducible alternate fit to the anomaly, but its supernova significance is calibration-dependent and its published mean vectors face adverse growth/full-shape predictions; the physical dark-matter claim fails promotion.</w:t>
       </w:r>
     </w:p>
     <w:p>
@@ -1346,7 +1403,32 @@
         <w:keepNext/>
       </w:pPr>
       <w:r>
-        <w:t xml:space="preserve">10. Frontier-standard boundary and development roadmap</w:t>
+        <w:t xml:space="preserve">10. What this establishes — and what it does not</w:t>
+      </w:r>
+    </w:p>
+    <w:p>
+      <w:pPr>
+        <w:widowControl/>
+        <w:jc w:val="both"/>
+      </w:pPr>
+      <w:r>
+        <w:t xml:space="preserve">Established: the published compressed likelihoods genuinely contain the reported preference; it survives independent reimplementation, optimizer attack, full Boltzmann physics, parameterization changes, and bootstrap calibration. Within CPL, a direct constant-w null test gives a calibrated 2.75σ preference for time variation, falling to 1.81σ without LRG2. The held-out LRG2 vector is a modest 2.05σ discrepancy, driven more by isotropic distance scale than by its shape ratio. Among ΛCDM mocks with a global preference this strong, a maximum deletion influence at least as large as observed occurs about half the time for CPL and 61% of the time for DDM. The July DDM background can reproduce much of the same geometry improvement, and its baseline DES5Y combination reaches p=0.0122; but its ordinary conditional localization, prior-wall optimum, worse fit than CPL, offset-branch p=0.0934, and adverse fixed-vector growth/full-shape predictions prevent promotion. Not established: that dark energy evolves; that dark matter has negative pressure; that LRG2 is wrong; that localization or the targeted held-out p-value is independent evidence; that the supernova calibration explanation is correct; that the fixed-vector SDSS check is a native nonlinear model-family exclusion; or that the PR3-native full-CMB variant reproduces DESI's PR4/ACT stack. The honest status is </w:t>
+      </w:r>
+      <w:r>
+        <w:rPr>
+          <w:b/>
+          <w:bCs/>
+        </w:rPr>
+        <w:t xml:space="preserve">a reproducible, LRG2-sensitive 2–3σ dark-energy hint and a DDM reinterpretation that now fails both calibration-identifiability and physical-prediction gates — not proof of either.</w:t>
+      </w:r>
+    </w:p>
+    <w:p>
+      <w:pPr>
+        <w:pStyle w:val="Heading1"/>
+        <w:keepNext/>
+      </w:pPr>
+      <w:r>
+        <w:t xml:space="preserve">11. Frontier-standard boundary and development roadmap</w:t>
       </w:r>
     </w:p>
     <w:p>
@@ -1960,7 +2042,7 @@
                 <w:sz w:val="16"/>
                 <w:szCs w:val="16"/>
               </w:rPr>
-              <w:t xml:space="preserve">Open</w:t>
+              <w:t xml:space="preserve">Adverse fixed-vector DDM test; native likelihoods open</w:t>
             </w:r>
           </w:p>
         </w:tc>
@@ -2193,7 +2275,7 @@
         <w:keepNext/>
       </w:pPr>
       <w:r>
-        <w:t xml:space="preserve">11. Falsifiable expectations</w:t>
+        <w:t xml:space="preserve">12. Falsifiable expectations</w:t>
       </w:r>
     </w:p>
     <w:p>
@@ -2202,7 +2284,7 @@
         <w:jc w:val="both"/>
       </w:pPr>
       <w:r>
-        <w:t xml:space="preserve">If the signal is physics: DESI's final likelihood (2027) retains the z ≈ 0.7 distance-scale departure at higher precision; Rubin-calibrated supernovae reproduce the low-z crossing with no magnitude offset required; growth and lensing co-vary as dynamical dark energy predicts. If it is systematics: the LRG2 distance residual regresses; the supernova preference tracks calibration choices across compilations; residuals decorrelate across probes. We pre-commit to updating this document against those outcomes.</w:t>
+        <w:t xml:space="preserve">If the signal is dynamical dark energy: DESI's final likelihood (2027) retains the z ≈ 0.7 distance-scale departure at higher precision; Rubin-calibrated supernovae reproduce the low-z crossing with no magnitude offset required; growth and lensing co-vary as that model predicts. If the July DDM interpretation is physical: a native nonlinear full-shape refit must overcome the low fixed-vector fσ₈ predictions; ACT/Planck lensing must tolerate the predicted linear lensing suppression; native shear likelihoods must favor the same transition rather than merely a low S₈ summary; the EoS posterior must stop tracking its prior wall; and nonlinear halo and dwarf-galaxy formation must remain viable. If the anomaly is systematic: the LRG2 distance residual regresses; the supernova preference tracks calibration choices across compilations; residuals decorrelate across probes. We pre-commit to updating this document against those outcomes.</w:t>
       </w:r>
     </w:p>
     <w:p>
@@ -2268,6 +2350,18 @@
         <w:t xml:space="preserve">python3 scripts/lrg2_posterior_predictive.py --mocks 5000 --workers 8 --fresh</w:t>
       </w:r>
       <w:r>
+        <w:t xml:space="preserve">. The complete DDM gate, including both 5,000-mock DES5Y calibrations and the pinned CLASS build, is </w:t>
+      </w:r>
+      <w:r>
+        <w:rPr>
+          <w:rFonts w:ascii="Courier New" w:cs="Courier New" w:eastAsia="Courier New" w:hAnsi="Courier New"/>
+          <w:color w:val="334155"/>
+          <w:sz w:val="18"/>
+          <w:szCs w:val="18"/>
+        </w:rPr>
+        <w:t xml:space="preserve">cleanroom/run_ddm_gate.sh 5000 8 cleanroom/ddm-verification</w:t>
+      </w:r>
+      <w:r>
         <w:t xml:space="preserve">. Results ship as JSON in </w:t>
       </w:r>
       <w:r>
@@ -2416,6 +2510,78 @@
       </w:pPr>
       <w:r>
         <w:t xml:space="preserve">Cortês and Liddle, “Interpreting DESI’s evidence for evolving dark energy,” arXiv:2504.15336.</w:t>
+      </w:r>
+    </w:p>
+    <w:p>
+      <w:pPr>
+        <w:pStyle w:val="ListParagraph"/>
+        <w:numPr>
+          <w:ilvl w:val="0"/>
+          <w:numId w:val="2"/>
+        </w:numPr>
+      </w:pPr>
+      <w:r>
+        <w:t xml:space="preserve">Ajith and Kumar, “Cosmological consequences of a dynamical dark matter in the light of DESI DR2 measurements,” arXiv:2607.18234.</w:t>
+      </w:r>
+    </w:p>
+    <w:p>
+      <w:pPr>
+        <w:pStyle w:val="ListParagraph"/>
+        <w:numPr>
+          <w:ilvl w:val="0"/>
+          <w:numId w:val="2"/>
+        </w:numPr>
+      </w:pPr>
+      <w:r>
+        <w:t xml:space="preserve">DESI Collaboration, “DESI 2024 VII: Cosmological Constraints from the Full-Shape Modeling of Clustering Measurements,” arXiv:2411.12022.</w:t>
+      </w:r>
+    </w:p>
+    <w:p>
+      <w:pPr>
+        <w:pStyle w:val="ListParagraph"/>
+        <w:numPr>
+          <w:ilvl w:val="0"/>
+          <w:numId w:val="2"/>
+        </w:numPr>
+      </w:pPr>
+      <w:r>
+        <w:t xml:space="preserve">Bautista et al., “The Completed SDSS-IV extended Baryon Oscillation Spectroscopic Survey: measurement of the BAO and growth rate of structure of the luminous red galaxy sample from the anisotropic correlation function between redshifts 0.6 and 1,” arXiv:2007.08993.</w:t>
+      </w:r>
+    </w:p>
+    <w:p>
+      <w:pPr>
+        <w:pStyle w:val="ListParagraph"/>
+        <w:numPr>
+          <w:ilvl w:val="0"/>
+          <w:numId w:val="2"/>
+        </w:numPr>
+      </w:pPr>
+      <w:r>
+        <w:t xml:space="preserve">DES Collaboration, “Dark Energy Survey Year 6 Results: Cosmological Constraints from Galaxy Clustering and Weak Lensing,” arXiv:2601.14559.</w:t>
+      </w:r>
+    </w:p>
+    <w:p>
+      <w:pPr>
+        <w:pStyle w:val="ListParagraph"/>
+        <w:numPr>
+          <w:ilvl w:val="0"/>
+          <w:numId w:val="2"/>
+        </w:numPr>
+      </w:pPr>
+      <w:r>
+        <w:t xml:space="preserve">Kopp, Skordis, and Thomas, “An extensive investigation of the Generalised Dark Matter model,” arXiv:1605.00649.</w:t>
+      </w:r>
+    </w:p>
+    <w:p>
+      <w:pPr>
+        <w:pStyle w:val="ListParagraph"/>
+        <w:numPr>
+          <w:ilvl w:val="0"/>
+          <w:numId w:val="2"/>
+        </w:numPr>
+      </w:pPr>
+      <w:r>
+        <w:t xml:space="preserve">Blas, Lesgourgues, and Tram, “The Cosmic Linear Anisotropy Solving System (CLASS) II: Approximation schemes,” arXiv:1104.2933.</w:t>
       </w:r>
     </w:p>
     <w:p>
@@ -6157,6 +6323,1426 @@
           </w:p>
         </w:tc>
       </w:tr>
+      <w:tr>
+        <w:trPr>
+          <w:cantSplit/>
+          <w:tblHeader w:val="false"/>
+        </w:trPr>
+        <w:tc>
+          <w:tcPr>
+            <w:tcW w:type="dxa" w:w="480"/>
+            <w:tcBorders>
+              <w:top w:val="single" w:color="A8B3C2" w:sz="2"/>
+              <w:left w:val="single" w:color="A8B3C2" w:sz="2"/>
+              <w:bottom w:val="single" w:color="A8B3C2" w:sz="2"/>
+              <w:right w:val="single" w:color="A8B3C2" w:sz="2"/>
+            </w:tcBorders>
+            <w:shd w:fill="F2F4F7" w:val="clear"/>
+            <w:tcMar>
+              <w:top w:type="dxa" w:w="70"/>
+              <w:left w:type="dxa" w:w="90"/>
+              <w:bottom w:type="dxa" w:w="70"/>
+              <w:right w:type="dxa" w:w="90"/>
+            </w:tcMar>
+            <w:vAlign w:val="center"/>
+          </w:tcPr>
+          <w:p>
+            <w:pPr>
+              <w:spacing w:after="0" w:before="0"/>
+            </w:pPr>
+            <w:r>
+              <w:rPr>
+                <w:b w:val="false"/>
+                <w:bCs w:val="false"/>
+                <w:color w:val="202B36"/>
+                <w:sz w:val="14"/>
+                <w:szCs w:val="14"/>
+              </w:rPr>
+              <w:t xml:space="preserve">26</w:t>
+            </w:r>
+          </w:p>
+        </w:tc>
+        <w:tc>
+          <w:tcPr>
+            <w:tcW w:type="dxa" w:w="2450"/>
+            <w:tcBorders>
+              <w:top w:val="single" w:color="A8B3C2" w:sz="2"/>
+              <w:left w:val="single" w:color="A8B3C2" w:sz="2"/>
+              <w:bottom w:val="single" w:color="A8B3C2" w:sz="2"/>
+              <w:right w:val="single" w:color="A8B3C2" w:sz="2"/>
+            </w:tcBorders>
+            <w:shd w:fill="F2F4F7" w:val="clear"/>
+            <w:tcMar>
+              <w:top w:type="dxa" w:w="70"/>
+              <w:left w:type="dxa" w:w="90"/>
+              <w:bottom w:type="dxa" w:w="70"/>
+              <w:right w:type="dxa" w:w="90"/>
+            </w:tcMar>
+            <w:vAlign w:val="center"/>
+          </w:tcPr>
+          <w:p>
+            <w:pPr>
+              <w:spacing w:after="0" w:before="0"/>
+            </w:pPr>
+            <w:r>
+              <w:rPr>
+                <w:b w:val="false"/>
+                <w:bCs w:val="false"/>
+                <w:color w:val="202B36"/>
+                <w:sz w:val="14"/>
+                <w:szCs w:val="14"/>
+              </w:rPr>
+              <w:t xml:space="preserve">July 2026 DDM exact-background geometry reproduction</w:t>
+            </w:r>
+          </w:p>
+        </w:tc>
+        <w:tc>
+          <w:tcPr>
+            <w:tcW w:type="dxa" w:w="4150"/>
+            <w:tcBorders>
+              <w:top w:val="single" w:color="A8B3C2" w:sz="2"/>
+              <w:left w:val="single" w:color="A8B3C2" w:sz="2"/>
+              <w:bottom w:val="single" w:color="A8B3C2" w:sz="2"/>
+              <w:right w:val="single" w:color="A8B3C2" w:sz="2"/>
+            </w:tcBorders>
+            <w:shd w:fill="F2F4F7" w:val="clear"/>
+            <w:tcMar>
+              <w:top w:type="dxa" w:w="70"/>
+              <w:left w:type="dxa" w:w="90"/>
+              <w:bottom w:type="dxa" w:w="70"/>
+              <w:right w:type="dxa" w:w="90"/>
+            </w:tcMar>
+            <w:vAlign w:val="center"/>
+          </w:tcPr>
+          <w:p>
+            <w:pPr>
+              <w:spacing w:after="0" w:before="0"/>
+            </w:pPr>
+            <w:r>
+              <w:rPr>
+                <w:b w:val="false"/>
+                <w:bCs w:val="false"/>
+                <w:color w:val="202B36"/>
+                <w:sz w:val="14"/>
+                <w:szCs w:val="14"/>
+              </w:rPr>
+              <w:t xml:space="preserve">Δχ²_DDM−Λ = −5.861 vs source full-CMB −6.558; exact CDM nesting</w:t>
+            </w:r>
+          </w:p>
+        </w:tc>
+        <w:tc>
+          <w:tcPr>
+            <w:tcW w:type="dxa" w:w="2600"/>
+            <w:tcBorders>
+              <w:top w:val="single" w:color="A8B3C2" w:sz="2"/>
+              <w:left w:val="single" w:color="A8B3C2" w:sz="2"/>
+              <w:bottom w:val="single" w:color="A8B3C2" w:sz="2"/>
+              <w:right w:val="single" w:color="A8B3C2" w:sz="2"/>
+            </w:tcBorders>
+            <w:shd w:fill="F2F4F7" w:val="clear"/>
+            <w:tcMar>
+              <w:top w:type="dxa" w:w="70"/>
+              <w:left w:type="dxa" w:w="90"/>
+              <w:bottom w:type="dxa" w:w="70"/>
+              <w:right w:type="dxa" w:w="90"/>
+            </w:tcMar>
+            <w:vAlign w:val="center"/>
+          </w:tcPr>
+          <w:p>
+            <w:pPr>
+              <w:spacing w:after="0" w:before="0"/>
+            </w:pPr>
+            <w:r>
+              <w:rPr>
+                <w:b w:val="false"/>
+                <w:bCs w:val="false"/>
+                <w:color w:val="202B36"/>
+                <w:sz w:val="14"/>
+                <w:szCs w:val="14"/>
+              </w:rPr>
+              <w:t xml:space="preserve">PASS AT BACKGROUND-SCREEN LEVEL</w:t>
+            </w:r>
+          </w:p>
+        </w:tc>
+      </w:tr>
+      <w:tr>
+        <w:trPr>
+          <w:cantSplit/>
+          <w:tblHeader w:val="false"/>
+        </w:trPr>
+        <w:tc>
+          <w:tcPr>
+            <w:tcW w:type="dxa" w:w="480"/>
+            <w:tcBorders>
+              <w:top w:val="single" w:color="A8B3C2" w:sz="2"/>
+              <w:left w:val="single" w:color="A8B3C2" w:sz="2"/>
+              <w:bottom w:val="single" w:color="A8B3C2" w:sz="2"/>
+              <w:right w:val="single" w:color="A8B3C2" w:sz="2"/>
+            </w:tcBorders>
+            <w:shd w:fill="FFFFFF" w:val="clear"/>
+            <w:tcMar>
+              <w:top w:type="dxa" w:w="70"/>
+              <w:left w:type="dxa" w:w="90"/>
+              <w:bottom w:type="dxa" w:w="70"/>
+              <w:right w:type="dxa" w:w="90"/>
+            </w:tcMar>
+            <w:vAlign w:val="center"/>
+          </w:tcPr>
+          <w:p>
+            <w:pPr>
+              <w:spacing w:after="0" w:before="0"/>
+            </w:pPr>
+            <w:r>
+              <w:rPr>
+                <w:b w:val="false"/>
+                <w:bCs w:val="false"/>
+                <w:color w:val="202B36"/>
+                <w:sz w:val="14"/>
+                <w:szCs w:val="14"/>
+              </w:rPr>
+              <w:t xml:space="preserve">27</w:t>
+            </w:r>
+          </w:p>
+        </w:tc>
+        <w:tc>
+          <w:tcPr>
+            <w:tcW w:type="dxa" w:w="2450"/>
+            <w:tcBorders>
+              <w:top w:val="single" w:color="A8B3C2" w:sz="2"/>
+              <w:left w:val="single" w:color="A8B3C2" w:sz="2"/>
+              <w:bottom w:val="single" w:color="A8B3C2" w:sz="2"/>
+              <w:right w:val="single" w:color="A8B3C2" w:sz="2"/>
+            </w:tcBorders>
+            <w:shd w:fill="FFFFFF" w:val="clear"/>
+            <w:tcMar>
+              <w:top w:type="dxa" w:w="70"/>
+              <w:left w:type="dxa" w:w="90"/>
+              <w:bottom w:type="dxa" w:w="70"/>
+              <w:right w:type="dxa" w:w="90"/>
+            </w:tcMar>
+            <w:vAlign w:val="center"/>
+          </w:tcPr>
+          <w:p>
+            <w:pPr>
+              <w:spacing w:after="0" w:before="0"/>
+            </w:pPr>
+            <w:r>
+              <w:rPr>
+                <w:b w:val="false"/>
+                <w:bCs w:val="false"/>
+                <w:color w:val="202B36"/>
+                <w:sz w:val="14"/>
+                <w:szCs w:val="14"/>
+              </w:rPr>
+              <w:t xml:space="preserve">Common-data ΛCDM / wCDM / CPL / DDM comparison</w:t>
+            </w:r>
+          </w:p>
+        </w:tc>
+        <w:tc>
+          <w:tcPr>
+            <w:tcW w:type="dxa" w:w="4150"/>
+            <w:tcBorders>
+              <w:top w:val="single" w:color="A8B3C2" w:sz="2"/>
+              <w:left w:val="single" w:color="A8B3C2" w:sz="2"/>
+              <w:bottom w:val="single" w:color="A8B3C2" w:sz="2"/>
+              <w:right w:val="single" w:color="A8B3C2" w:sz="2"/>
+            </w:tcBorders>
+            <w:shd w:fill="FFFFFF" w:val="clear"/>
+            <w:tcMar>
+              <w:top w:type="dxa" w:w="70"/>
+              <w:left w:type="dxa" w:w="90"/>
+              <w:bottom w:type="dxa" w:w="70"/>
+              <w:right w:type="dxa" w:w="90"/>
+            </w:tcMar>
+            <w:vAlign w:val="center"/>
+          </w:tcPr>
+          <w:p>
+            <w:pPr>
+              <w:spacing w:after="0" w:before="0"/>
+            </w:pPr>
+            <w:r>
+              <w:rPr>
+                <w:b w:val="false"/>
+                <w:bCs w:val="false"/>
+                <w:color w:val="202B36"/>
+                <w:sz w:val="14"/>
+                <w:szCs w:val="14"/>
+              </w:rPr>
+              <w:t xml:space="preserve">χ² = 15.578 / 14.971 / 7.120 / 9.717; CPL lowest AIC</w:t>
+            </w:r>
+          </w:p>
+        </w:tc>
+        <w:tc>
+          <w:tcPr>
+            <w:tcW w:type="dxa" w:w="2600"/>
+            <w:tcBorders>
+              <w:top w:val="single" w:color="A8B3C2" w:sz="2"/>
+              <w:left w:val="single" w:color="A8B3C2" w:sz="2"/>
+              <w:bottom w:val="single" w:color="A8B3C2" w:sz="2"/>
+              <w:right w:val="single" w:color="A8B3C2" w:sz="2"/>
+            </w:tcBorders>
+            <w:shd w:fill="FFFFFF" w:val="clear"/>
+            <w:tcMar>
+              <w:top w:type="dxa" w:w="70"/>
+              <w:left w:type="dxa" w:w="90"/>
+              <w:bottom w:type="dxa" w:w="70"/>
+              <w:right w:type="dxa" w:w="90"/>
+            </w:tcMar>
+            <w:vAlign w:val="center"/>
+          </w:tcPr>
+          <w:p>
+            <w:pPr>
+              <w:spacing w:after="0" w:before="0"/>
+            </w:pPr>
+            <w:r>
+              <w:rPr>
+                <w:b w:val="false"/>
+                <w:bCs w:val="false"/>
+                <w:color w:val="202B36"/>
+                <w:sz w:val="14"/>
+                <w:szCs w:val="14"/>
+              </w:rPr>
+              <w:t xml:space="preserve">DDM NOT SELECTED</w:t>
+            </w:r>
+          </w:p>
+        </w:tc>
+      </w:tr>
+      <w:tr>
+        <w:trPr>
+          <w:cantSplit/>
+          <w:tblHeader w:val="false"/>
+        </w:trPr>
+        <w:tc>
+          <w:tcPr>
+            <w:tcW w:type="dxa" w:w="480"/>
+            <w:tcBorders>
+              <w:top w:val="single" w:color="A8B3C2" w:sz="2"/>
+              <w:left w:val="single" w:color="A8B3C2" w:sz="2"/>
+              <w:bottom w:val="single" w:color="A8B3C2" w:sz="2"/>
+              <w:right w:val="single" w:color="A8B3C2" w:sz="2"/>
+            </w:tcBorders>
+            <w:shd w:fill="F2F4F7" w:val="clear"/>
+            <w:tcMar>
+              <w:top w:type="dxa" w:w="70"/>
+              <w:left w:type="dxa" w:w="90"/>
+              <w:bottom w:type="dxa" w:w="70"/>
+              <w:right w:type="dxa" w:w="90"/>
+            </w:tcMar>
+            <w:vAlign w:val="center"/>
+          </w:tcPr>
+          <w:p>
+            <w:pPr>
+              <w:spacing w:after="0" w:before="0"/>
+            </w:pPr>
+            <w:r>
+              <w:rPr>
+                <w:b w:val="false"/>
+                <w:bCs w:val="false"/>
+                <w:color w:val="202B36"/>
+                <w:sz w:val="14"/>
+                <w:szCs w:val="14"/>
+              </w:rPr>
+              <w:t xml:space="preserve">28</w:t>
+            </w:r>
+          </w:p>
+        </w:tc>
+        <w:tc>
+          <w:tcPr>
+            <w:tcW w:type="dxa" w:w="2450"/>
+            <w:tcBorders>
+              <w:top w:val="single" w:color="A8B3C2" w:sz="2"/>
+              <w:left w:val="single" w:color="A8B3C2" w:sz="2"/>
+              <w:bottom w:val="single" w:color="A8B3C2" w:sz="2"/>
+              <w:right w:val="single" w:color="A8B3C2" w:sz="2"/>
+            </w:tcBorders>
+            <w:shd w:fill="F2F4F7" w:val="clear"/>
+            <w:tcMar>
+              <w:top w:type="dxa" w:w="70"/>
+              <w:left w:type="dxa" w:w="90"/>
+              <w:bottom w:type="dxa" w:w="70"/>
+              <w:right w:type="dxa" w:w="90"/>
+            </w:tcMar>
+            <w:vAlign w:val="center"/>
+          </w:tcPr>
+          <w:p>
+            <w:pPr>
+              <w:spacing w:after="0" w:before="0"/>
+            </w:pPr>
+            <w:r>
+              <w:rPr>
+                <w:b w:val="false"/>
+                <w:bCs w:val="false"/>
+                <w:color w:val="202B36"/>
+                <w:sz w:val="14"/>
+                <w:szCs w:val="14"/>
+              </w:rPr>
+              <w:t xml:space="preserve">DDM prior sensitivity</w:t>
+            </w:r>
+          </w:p>
+        </w:tc>
+        <w:tc>
+          <w:tcPr>
+            <w:tcW w:type="dxa" w:w="4150"/>
+            <w:tcBorders>
+              <w:top w:val="single" w:color="A8B3C2" w:sz="2"/>
+              <w:left w:val="single" w:color="A8B3C2" w:sz="2"/>
+              <w:bottom w:val="single" w:color="A8B3C2" w:sz="2"/>
+              <w:right w:val="single" w:color="A8B3C2" w:sz="2"/>
+            </w:tcBorders>
+            <w:shd w:fill="F2F4F7" w:val="clear"/>
+            <w:tcMar>
+              <w:top w:type="dxa" w:w="70"/>
+              <w:left w:type="dxa" w:w="90"/>
+              <w:bottom w:type="dxa" w:w="70"/>
+              <w:right w:type="dxa" w:w="90"/>
+            </w:tcMar>
+            <w:vAlign w:val="center"/>
+          </w:tcPr>
+          <w:p>
+            <w:pPr>
+              <w:spacing w:after="0" w:before="0"/>
+            </w:pPr>
+            <w:r>
+              <w:rPr>
+                <w:b w:val="false"/>
+                <w:bCs w:val="false"/>
+                <w:color w:val="202B36"/>
+                <w:sz w:val="14"/>
+                <w:szCs w:val="14"/>
+              </w:rPr>
+              <w:t xml:space="preserve">best w₀ᵈᵐ follows −0.05/−0.10/−0.20 walls; T=5.681/5.861/6.024</w:t>
+            </w:r>
+          </w:p>
+        </w:tc>
+        <w:tc>
+          <w:tcPr>
+            <w:tcW w:type="dxa" w:w="2600"/>
+            <w:tcBorders>
+              <w:top w:val="single" w:color="A8B3C2" w:sz="2"/>
+              <w:left w:val="single" w:color="A8B3C2" w:sz="2"/>
+              <w:bottom w:val="single" w:color="A8B3C2" w:sz="2"/>
+              <w:right w:val="single" w:color="A8B3C2" w:sz="2"/>
+            </w:tcBorders>
+            <w:shd w:fill="F2F4F7" w:val="clear"/>
+            <w:tcMar>
+              <w:top w:type="dxa" w:w="70"/>
+              <w:left w:type="dxa" w:w="90"/>
+              <w:bottom w:type="dxa" w:w="70"/>
+              <w:right w:type="dxa" w:w="90"/>
+            </w:tcMar>
+            <w:vAlign w:val="center"/>
+          </w:tcPr>
+          <w:p>
+            <w:pPr>
+              <w:spacing w:after="0" w:before="0"/>
+            </w:pPr>
+            <w:r>
+              <w:rPr>
+                <w:b w:val="false"/>
+                <w:bCs w:val="false"/>
+                <w:color w:val="202B36"/>
+                <w:sz w:val="14"/>
+                <w:szCs w:val="14"/>
+              </w:rPr>
+              <w:t xml:space="preserve">PARAMETER CLAIM NOT PRIOR-STABLE</w:t>
+            </w:r>
+          </w:p>
+        </w:tc>
+      </w:tr>
+      <w:tr>
+        <w:trPr>
+          <w:cantSplit/>
+          <w:tblHeader w:val="false"/>
+        </w:trPr>
+        <w:tc>
+          <w:tcPr>
+            <w:tcW w:type="dxa" w:w="480"/>
+            <w:tcBorders>
+              <w:top w:val="single" w:color="A8B3C2" w:sz="2"/>
+              <w:left w:val="single" w:color="A8B3C2" w:sz="2"/>
+              <w:bottom w:val="single" w:color="A8B3C2" w:sz="2"/>
+              <w:right w:val="single" w:color="A8B3C2" w:sz="2"/>
+            </w:tcBorders>
+            <w:shd w:fill="FFFFFF" w:val="clear"/>
+            <w:tcMar>
+              <w:top w:type="dxa" w:w="70"/>
+              <w:left w:type="dxa" w:w="90"/>
+              <w:bottom w:type="dxa" w:w="70"/>
+              <w:right w:type="dxa" w:w="90"/>
+            </w:tcMar>
+            <w:vAlign w:val="center"/>
+          </w:tcPr>
+          <w:p>
+            <w:pPr>
+              <w:spacing w:after="0" w:before="0"/>
+            </w:pPr>
+            <w:r>
+              <w:rPr>
+                <w:b w:val="false"/>
+                <w:bCs w:val="false"/>
+                <w:color w:val="202B36"/>
+                <w:sz w:val="14"/>
+                <w:szCs w:val="14"/>
+              </w:rPr>
+              <w:t xml:space="preserve">29</w:t>
+            </w:r>
+          </w:p>
+        </w:tc>
+        <w:tc>
+          <w:tcPr>
+            <w:tcW w:type="dxa" w:w="2450"/>
+            <w:tcBorders>
+              <w:top w:val="single" w:color="A8B3C2" w:sz="2"/>
+              <w:left w:val="single" w:color="A8B3C2" w:sz="2"/>
+              <w:bottom w:val="single" w:color="A8B3C2" w:sz="2"/>
+              <w:right w:val="single" w:color="A8B3C2" w:sz="2"/>
+            </w:tcBorders>
+            <w:shd w:fill="FFFFFF" w:val="clear"/>
+            <w:tcMar>
+              <w:top w:type="dxa" w:w="70"/>
+              <w:left w:type="dxa" w:w="90"/>
+              <w:bottom w:type="dxa" w:w="70"/>
+              <w:right w:type="dxa" w:w="90"/>
+            </w:tcMar>
+            <w:vAlign w:val="center"/>
+          </w:tcPr>
+          <w:p>
+            <w:pPr>
+              <w:spacing w:after="0" w:before="0"/>
+            </w:pPr>
+            <w:r>
+              <w:rPr>
+                <w:b w:val="false"/>
+                <w:bCs w:val="false"/>
+                <w:color w:val="202B36"/>
+                <w:sz w:val="14"/>
+                <w:szCs w:val="14"/>
+              </w:rPr>
+              <w:t xml:space="preserve">DDM non-regular ΛCDM bootstrap, 5,000 mocks</w:t>
+            </w:r>
+          </w:p>
+        </w:tc>
+        <w:tc>
+          <w:tcPr>
+            <w:tcW w:type="dxa" w:w="4150"/>
+            <w:tcBorders>
+              <w:top w:val="single" w:color="A8B3C2" w:sz="2"/>
+              <w:left w:val="single" w:color="A8B3C2" w:sz="2"/>
+              <w:bottom w:val="single" w:color="A8B3C2" w:sz="2"/>
+              <w:right w:val="single" w:color="A8B3C2" w:sz="2"/>
+            </w:tcBorders>
+            <w:shd w:fill="FFFFFF" w:val="clear"/>
+            <w:tcMar>
+              <w:top w:type="dxa" w:w="70"/>
+              <w:left w:type="dxa" w:w="90"/>
+              <w:bottom w:type="dxa" w:w="70"/>
+              <w:right w:type="dxa" w:w="90"/>
+            </w:tcMar>
+            <w:vAlign w:val="center"/>
+          </w:tcPr>
+          <w:p>
+            <w:pPr>
+              <w:spacing w:after="0" w:before="0"/>
+            </w:pPr>
+            <w:r>
+              <w:rPr>
+                <w:b w:val="false"/>
+                <w:bCs w:val="false"/>
+                <w:color w:val="202B36"/>
+                <w:sz w:val="14"/>
+                <w:szCs w:val="14"/>
+              </w:rPr>
+              <w:t xml:space="preserve">T=5.861; 354/5,000; p=0.0708 [0.0638–0.0783]</w:t>
+            </w:r>
+          </w:p>
+        </w:tc>
+        <w:tc>
+          <w:tcPr>
+            <w:tcW w:type="dxa" w:w="2600"/>
+            <w:tcBorders>
+              <w:top w:val="single" w:color="A8B3C2" w:sz="2"/>
+              <w:left w:val="single" w:color="A8B3C2" w:sz="2"/>
+              <w:bottom w:val="single" w:color="A8B3C2" w:sz="2"/>
+              <w:right w:val="single" w:color="A8B3C2" w:sz="2"/>
+            </w:tcBorders>
+            <w:shd w:fill="FFFFFF" w:val="clear"/>
+            <w:tcMar>
+              <w:top w:type="dxa" w:w="70"/>
+              <w:left w:type="dxa" w:w="90"/>
+              <w:bottom w:type="dxa" w:w="70"/>
+              <w:right w:type="dxa" w:w="90"/>
+            </w:tcMar>
+            <w:vAlign w:val="center"/>
+          </w:tcPr>
+          <w:p>
+            <w:pPr>
+              <w:spacing w:after="0" w:before="0"/>
+            </w:pPr>
+            <w:r>
+              <w:rPr>
+                <w:b w:val="false"/>
+                <w:bCs w:val="false"/>
+                <w:color w:val="202B36"/>
+                <w:sz w:val="14"/>
+                <w:szCs w:val="14"/>
+              </w:rPr>
+              <w:t xml:space="preserve">FAILS MODEL-SIGNIFICANCE GATE</w:t>
+            </w:r>
+          </w:p>
+        </w:tc>
+      </w:tr>
+      <w:tr>
+        <w:trPr>
+          <w:cantSplit/>
+          <w:tblHeader w:val="false"/>
+        </w:trPr>
+        <w:tc>
+          <w:tcPr>
+            <w:tcW w:type="dxa" w:w="480"/>
+            <w:tcBorders>
+              <w:top w:val="single" w:color="A8B3C2" w:sz="2"/>
+              <w:left w:val="single" w:color="A8B3C2" w:sz="2"/>
+              <w:bottom w:val="single" w:color="A8B3C2" w:sz="2"/>
+              <w:right w:val="single" w:color="A8B3C2" w:sz="2"/>
+            </w:tcBorders>
+            <w:shd w:fill="F2F4F7" w:val="clear"/>
+            <w:tcMar>
+              <w:top w:type="dxa" w:w="70"/>
+              <w:left w:type="dxa" w:w="90"/>
+              <w:bottom w:type="dxa" w:w="70"/>
+              <w:right w:type="dxa" w:w="90"/>
+            </w:tcMar>
+            <w:vAlign w:val="center"/>
+          </w:tcPr>
+          <w:p>
+            <w:pPr>
+              <w:spacing w:after="0" w:before="0"/>
+            </w:pPr>
+            <w:r>
+              <w:rPr>
+                <w:b w:val="false"/>
+                <w:bCs w:val="false"/>
+                <w:color w:val="202B36"/>
+                <w:sz w:val="14"/>
+                <w:szCs w:val="14"/>
+              </w:rPr>
+              <w:t xml:space="preserve">30</w:t>
+            </w:r>
+          </w:p>
+        </w:tc>
+        <w:tc>
+          <w:tcPr>
+            <w:tcW w:type="dxa" w:w="2450"/>
+            <w:tcBorders>
+              <w:top w:val="single" w:color="A8B3C2" w:sz="2"/>
+              <w:left w:val="single" w:color="A8B3C2" w:sz="2"/>
+              <w:bottom w:val="single" w:color="A8B3C2" w:sz="2"/>
+              <w:right w:val="single" w:color="A8B3C2" w:sz="2"/>
+            </w:tcBorders>
+            <w:shd w:fill="F2F4F7" w:val="clear"/>
+            <w:tcMar>
+              <w:top w:type="dxa" w:w="70"/>
+              <w:left w:type="dxa" w:w="90"/>
+              <w:bottom w:type="dxa" w:w="70"/>
+              <w:right w:type="dxa" w:w="90"/>
+            </w:tcMar>
+            <w:vAlign w:val="center"/>
+          </w:tcPr>
+          <w:p>
+            <w:pPr>
+              <w:spacing w:after="0" w:before="0"/>
+            </w:pPr>
+            <w:r>
+              <w:rPr>
+                <w:b w:val="false"/>
+                <w:bCs w:val="false"/>
+                <w:color w:val="202B36"/>
+                <w:sz w:val="14"/>
+                <w:szCs w:val="14"/>
+              </w:rPr>
+              <w:t xml:space="preserve">DDM deletion and selection calibration</w:t>
+            </w:r>
+          </w:p>
+        </w:tc>
+        <w:tc>
+          <w:tcPr>
+            <w:tcW w:type="dxa" w:w="4150"/>
+            <w:tcBorders>
+              <w:top w:val="single" w:color="A8B3C2" w:sz="2"/>
+              <w:left w:val="single" w:color="A8B3C2" w:sz="2"/>
+              <w:bottom w:val="single" w:color="A8B3C2" w:sz="2"/>
+              <w:right w:val="single" w:color="A8B3C2" w:sz="2"/>
+            </w:tcBorders>
+            <w:shd w:fill="F2F4F7" w:val="clear"/>
+            <w:tcMar>
+              <w:top w:type="dxa" w:w="70"/>
+              <w:left w:type="dxa" w:w="90"/>
+              <w:bottom w:type="dxa" w:w="70"/>
+              <w:right w:type="dxa" w:w="90"/>
+            </w:tcMar>
+            <w:vAlign w:val="center"/>
+          </w:tcPr>
+          <w:p>
+            <w:pPr>
+              <w:spacing w:after="0" w:before="0"/>
+            </w:pPr>
+            <w:r>
+              <w:rPr>
+                <w:b w:val="false"/>
+                <w:bCs w:val="false"/>
+                <w:color w:val="202B36"/>
+                <w:sz w:val="14"/>
+                <w:szCs w:val="14"/>
+              </w:rPr>
+              <w:t xml:space="preserve">LRG2: T 5.861→3.461; no-LRG2 p=0.2278; conditional selected influence 216/354, p=0.610 [0.557–0.661]</w:t>
+            </w:r>
+          </w:p>
+        </w:tc>
+        <w:tc>
+          <w:tcPr>
+            <w:tcW w:type="dxa" w:w="2600"/>
+            <w:tcBorders>
+              <w:top w:val="single" w:color="A8B3C2" w:sz="2"/>
+              <w:left w:val="single" w:color="A8B3C2" w:sz="2"/>
+              <w:bottom w:val="single" w:color="A8B3C2" w:sz="2"/>
+              <w:right w:val="single" w:color="A8B3C2" w:sz="2"/>
+            </w:tcBorders>
+            <w:shd w:fill="F2F4F7" w:val="clear"/>
+            <w:tcMar>
+              <w:top w:type="dxa" w:w="70"/>
+              <w:left w:type="dxa" w:w="90"/>
+              <w:bottom w:type="dxa" w:w="70"/>
+              <w:right w:type="dxa" w:w="90"/>
+            </w:tcMar>
+            <w:vAlign w:val="center"/>
+          </w:tcPr>
+          <w:p>
+            <w:pPr>
+              <w:spacing w:after="0" w:before="0"/>
+            </w:pPr>
+            <w:r>
+              <w:rPr>
+                <w:b w:val="false"/>
+                <w:bCs w:val="false"/>
+                <w:color w:val="202B36"/>
+                <w:sz w:val="14"/>
+                <w:szCs w:val="14"/>
+              </w:rPr>
+              <w:t xml:space="preserve">LRG2-SENSITIVE, BUT LOCALIZATION ORDINARY</w:t>
+            </w:r>
+          </w:p>
+        </w:tc>
+      </w:tr>
+      <w:tr>
+        <w:trPr>
+          <w:cantSplit/>
+          <w:tblHeader w:val="false"/>
+        </w:trPr>
+        <w:tc>
+          <w:tcPr>
+            <w:tcW w:type="dxa" w:w="480"/>
+            <w:tcBorders>
+              <w:top w:val="single" w:color="A8B3C2" w:sz="2"/>
+              <w:left w:val="single" w:color="A8B3C2" w:sz="2"/>
+              <w:bottom w:val="single" w:color="A8B3C2" w:sz="2"/>
+              <w:right w:val="single" w:color="A8B3C2" w:sz="2"/>
+            </w:tcBorders>
+            <w:shd w:fill="FFFFFF" w:val="clear"/>
+            <w:tcMar>
+              <w:top w:type="dxa" w:w="70"/>
+              <w:left w:type="dxa" w:w="90"/>
+              <w:bottom w:type="dxa" w:w="70"/>
+              <w:right w:type="dxa" w:w="90"/>
+            </w:tcMar>
+            <w:vAlign w:val="center"/>
+          </w:tcPr>
+          <w:p>
+            <w:pPr>
+              <w:spacing w:after="0" w:before="0"/>
+            </w:pPr>
+            <w:r>
+              <w:rPr>
+                <w:b w:val="false"/>
+                <w:bCs w:val="false"/>
+                <w:color w:val="202B36"/>
+                <w:sz w:val="14"/>
+                <w:szCs w:val="14"/>
+              </w:rPr>
+              <w:t xml:space="preserve">31</w:t>
+            </w:r>
+          </w:p>
+        </w:tc>
+        <w:tc>
+          <w:tcPr>
+            <w:tcW w:type="dxa" w:w="2450"/>
+            <w:tcBorders>
+              <w:top w:val="single" w:color="A8B3C2" w:sz="2"/>
+              <w:left w:val="single" w:color="A8B3C2" w:sz="2"/>
+              <w:bottom w:val="single" w:color="A8B3C2" w:sz="2"/>
+              <w:right w:val="single" w:color="A8B3C2" w:sz="2"/>
+            </w:tcBorders>
+            <w:shd w:fill="FFFFFF" w:val="clear"/>
+            <w:tcMar>
+              <w:top w:type="dxa" w:w="70"/>
+              <w:left w:type="dxa" w:w="90"/>
+              <w:bottom w:type="dxa" w:w="70"/>
+              <w:right w:type="dxa" w:w="90"/>
+            </w:tcMar>
+            <w:vAlign w:val="center"/>
+          </w:tcPr>
+          <w:p>
+            <w:pPr>
+              <w:spacing w:after="0" w:before="0"/>
+            </w:pPr>
+            <w:r>
+              <w:rPr>
+                <w:b w:val="false"/>
+                <w:bCs w:val="false"/>
+                <w:color w:val="202B36"/>
+                <w:sz w:val="14"/>
+                <w:szCs w:val="14"/>
+              </w:rPr>
+              <w:t xml:space="preserve">DDM DES5Y matched non-regular null</w:t>
+            </w:r>
+          </w:p>
+        </w:tc>
+        <w:tc>
+          <w:tcPr>
+            <w:tcW w:type="dxa" w:w="4150"/>
+            <w:tcBorders>
+              <w:top w:val="single" w:color="A8B3C2" w:sz="2"/>
+              <w:left w:val="single" w:color="A8B3C2" w:sz="2"/>
+              <w:bottom w:val="single" w:color="A8B3C2" w:sz="2"/>
+              <w:right w:val="single" w:color="A8B3C2" w:sz="2"/>
+            </w:tcBorders>
+            <w:shd w:fill="FFFFFF" w:val="clear"/>
+            <w:tcMar>
+              <w:top w:type="dxa" w:w="70"/>
+              <w:left w:type="dxa" w:w="90"/>
+              <w:bottom w:type="dxa" w:w="70"/>
+              <w:right w:type="dxa" w:w="90"/>
+            </w:tcMar>
+            <w:vAlign w:val="center"/>
+          </w:tcPr>
+          <w:p>
+            <w:pPr>
+              <w:spacing w:after="0" w:before="0"/>
+            </w:pPr>
+            <w:r>
+              <w:rPr>
+                <w:b w:val="false"/>
+                <w:bCs w:val="false"/>
+                <w:color w:val="202B36"/>
+                <w:sz w:val="14"/>
+                <w:szCs w:val="14"/>
+              </w:rPr>
+              <w:t xml:space="preserve">baseline T=9.603; 61/5,000; p=0.0122 [0.00934–0.01564]</w:t>
+            </w:r>
+          </w:p>
+        </w:tc>
+        <w:tc>
+          <w:tcPr>
+            <w:tcW w:type="dxa" w:w="2600"/>
+            <w:tcBorders>
+              <w:top w:val="single" w:color="A8B3C2" w:sz="2"/>
+              <w:left w:val="single" w:color="A8B3C2" w:sz="2"/>
+              <w:bottom w:val="single" w:color="A8B3C2" w:sz="2"/>
+              <w:right w:val="single" w:color="A8B3C2" w:sz="2"/>
+            </w:tcBorders>
+            <w:shd w:fill="FFFFFF" w:val="clear"/>
+            <w:tcMar>
+              <w:top w:type="dxa" w:w="70"/>
+              <w:left w:type="dxa" w:w="90"/>
+              <w:bottom w:type="dxa" w:w="70"/>
+              <w:right w:type="dxa" w:w="90"/>
+            </w:tcMar>
+            <w:vAlign w:val="center"/>
+          </w:tcPr>
+          <w:p>
+            <w:pPr>
+              <w:spacing w:after="0" w:before="0"/>
+            </w:pPr>
+            <w:r>
+              <w:rPr>
+                <w:b w:val="false"/>
+                <w:bCs w:val="false"/>
+                <w:color w:val="202B36"/>
+                <w:sz w:val="14"/>
+                <w:szCs w:val="14"/>
+              </w:rPr>
+              <w:t xml:space="preserve">INTERESTING COMBINED-DATA HINT</w:t>
+            </w:r>
+          </w:p>
+        </w:tc>
+      </w:tr>
+      <w:tr>
+        <w:trPr>
+          <w:cantSplit/>
+          <w:tblHeader w:val="false"/>
+        </w:trPr>
+        <w:tc>
+          <w:tcPr>
+            <w:tcW w:type="dxa" w:w="480"/>
+            <w:tcBorders>
+              <w:top w:val="single" w:color="A8B3C2" w:sz="2"/>
+              <w:left w:val="single" w:color="A8B3C2" w:sz="2"/>
+              <w:bottom w:val="single" w:color="A8B3C2" w:sz="2"/>
+              <w:right w:val="single" w:color="A8B3C2" w:sz="2"/>
+            </w:tcBorders>
+            <w:shd w:fill="F2F4F7" w:val="clear"/>
+            <w:tcMar>
+              <w:top w:type="dxa" w:w="70"/>
+              <w:left w:type="dxa" w:w="90"/>
+              <w:bottom w:type="dxa" w:w="70"/>
+              <w:right w:type="dxa" w:w="90"/>
+            </w:tcMar>
+            <w:vAlign w:val="center"/>
+          </w:tcPr>
+          <w:p>
+            <w:pPr>
+              <w:spacing w:after="0" w:before="0"/>
+            </w:pPr>
+            <w:r>
+              <w:rPr>
+                <w:b w:val="false"/>
+                <w:bCs w:val="false"/>
+                <w:color w:val="202B36"/>
+                <w:sz w:val="14"/>
+                <w:szCs w:val="14"/>
+              </w:rPr>
+              <w:t xml:space="preserve">32</w:t>
+            </w:r>
+          </w:p>
+        </w:tc>
+        <w:tc>
+          <w:tcPr>
+            <w:tcW w:type="dxa" w:w="2450"/>
+            <w:tcBorders>
+              <w:top w:val="single" w:color="A8B3C2" w:sz="2"/>
+              <w:left w:val="single" w:color="A8B3C2" w:sz="2"/>
+              <w:bottom w:val="single" w:color="A8B3C2" w:sz="2"/>
+              <w:right w:val="single" w:color="A8B3C2" w:sz="2"/>
+            </w:tcBorders>
+            <w:shd w:fill="F2F4F7" w:val="clear"/>
+            <w:tcMar>
+              <w:top w:type="dxa" w:w="70"/>
+              <w:left w:type="dxa" w:w="90"/>
+              <w:bottom w:type="dxa" w:w="70"/>
+              <w:right w:type="dxa" w:w="90"/>
+            </w:tcMar>
+            <w:vAlign w:val="center"/>
+          </w:tcPr>
+          <w:p>
+            <w:pPr>
+              <w:spacing w:after="0" w:before="0"/>
+            </w:pPr>
+            <w:r>
+              <w:rPr>
+                <w:b w:val="false"/>
+                <w:bCs w:val="false"/>
+                <w:color w:val="202B36"/>
+                <w:sz w:val="14"/>
+                <w:szCs w:val="14"/>
+              </w:rPr>
+              <w:t xml:space="preserve">DDM low-z offset with separately fitted null</w:t>
+            </w:r>
+          </w:p>
+        </w:tc>
+        <w:tc>
+          <w:tcPr>
+            <w:tcW w:type="dxa" w:w="4150"/>
+            <w:tcBorders>
+              <w:top w:val="single" w:color="A8B3C2" w:sz="2"/>
+              <w:left w:val="single" w:color="A8B3C2" w:sz="2"/>
+              <w:bottom w:val="single" w:color="A8B3C2" w:sz="2"/>
+              <w:right w:val="single" w:color="A8B3C2" w:sz="2"/>
+            </w:tcBorders>
+            <w:shd w:fill="F2F4F7" w:val="clear"/>
+            <w:tcMar>
+              <w:top w:type="dxa" w:w="70"/>
+              <w:left w:type="dxa" w:w="90"/>
+              <w:bottom w:type="dxa" w:w="70"/>
+              <w:right w:type="dxa" w:w="90"/>
+            </w:tcMar>
+            <w:vAlign w:val="center"/>
+          </w:tcPr>
+          <w:p>
+            <w:pPr>
+              <w:spacing w:after="0" w:before="0"/>
+            </w:pPr>
+            <w:r>
+              <w:rPr>
+                <w:b w:val="false"/>
+                <w:bCs w:val="false"/>
+                <w:color w:val="202B36"/>
+                <w:sz w:val="14"/>
+                <w:szCs w:val="14"/>
+              </w:rPr>
+              <w:t xml:space="preserve">+0.0315 mag; T=5.358; 467/5,000; p=0.0934 [0.0855–0.1018]</w:t>
+            </w:r>
+          </w:p>
+        </w:tc>
+        <w:tc>
+          <w:tcPr>
+            <w:tcW w:type="dxa" w:w="2600"/>
+            <w:tcBorders>
+              <w:top w:val="single" w:color="A8B3C2" w:sz="2"/>
+              <w:left w:val="single" w:color="A8B3C2" w:sz="2"/>
+              <w:bottom w:val="single" w:color="A8B3C2" w:sz="2"/>
+              <w:right w:val="single" w:color="A8B3C2" w:sz="2"/>
+            </w:tcBorders>
+            <w:shd w:fill="F2F4F7" w:val="clear"/>
+            <w:tcMar>
+              <w:top w:type="dxa" w:w="70"/>
+              <w:left w:type="dxa" w:w="90"/>
+              <w:bottom w:type="dxa" w:w="70"/>
+              <w:right w:type="dxa" w:w="90"/>
+            </w:tcMar>
+            <w:vAlign w:val="center"/>
+          </w:tcPr>
+          <w:p>
+            <w:pPr>
+              <w:spacing w:after="0" w:before="0"/>
+            </w:pPr>
+            <w:r>
+              <w:rPr>
+                <w:b w:val="false"/>
+                <w:bCs w:val="false"/>
+                <w:color w:val="202B36"/>
+                <w:sz w:val="14"/>
+                <w:szCs w:val="14"/>
+              </w:rPr>
+              <w:t xml:space="preserve">MODEL SIGNIFICANCE CALIBRATION-DEPENDENT</w:t>
+            </w:r>
+          </w:p>
+        </w:tc>
+      </w:tr>
+      <w:tr>
+        <w:trPr>
+          <w:cantSplit/>
+          <w:tblHeader w:val="false"/>
+        </w:trPr>
+        <w:tc>
+          <w:tcPr>
+            <w:tcW w:type="dxa" w:w="480"/>
+            <w:tcBorders>
+              <w:top w:val="single" w:color="A8B3C2" w:sz="2"/>
+              <w:left w:val="single" w:color="A8B3C2" w:sz="2"/>
+              <w:bottom w:val="single" w:color="A8B3C2" w:sz="2"/>
+              <w:right w:val="single" w:color="A8B3C2" w:sz="2"/>
+            </w:tcBorders>
+            <w:shd w:fill="FFFFFF" w:val="clear"/>
+            <w:tcMar>
+              <w:top w:type="dxa" w:w="70"/>
+              <w:left w:type="dxa" w:w="90"/>
+              <w:bottom w:type="dxa" w:w="70"/>
+              <w:right w:type="dxa" w:w="90"/>
+            </w:tcMar>
+            <w:vAlign w:val="center"/>
+          </w:tcPr>
+          <w:p>
+            <w:pPr>
+              <w:spacing w:after="0" w:before="0"/>
+            </w:pPr>
+            <w:r>
+              <w:rPr>
+                <w:b w:val="false"/>
+                <w:bCs w:val="false"/>
+                <w:color w:val="202B36"/>
+                <w:sz w:val="14"/>
+                <w:szCs w:val="14"/>
+              </w:rPr>
+              <w:t xml:space="preserve">33</w:t>
+            </w:r>
+          </w:p>
+        </w:tc>
+        <w:tc>
+          <w:tcPr>
+            <w:tcW w:type="dxa" w:w="2450"/>
+            <w:tcBorders>
+              <w:top w:val="single" w:color="A8B3C2" w:sz="2"/>
+              <w:left w:val="single" w:color="A8B3C2" w:sz="2"/>
+              <w:bottom w:val="single" w:color="A8B3C2" w:sz="2"/>
+              <w:right w:val="single" w:color="A8B3C2" w:sz="2"/>
+            </w:tcBorders>
+            <w:shd w:fill="FFFFFF" w:val="clear"/>
+            <w:tcMar>
+              <w:top w:type="dxa" w:w="70"/>
+              <w:left w:type="dxa" w:w="90"/>
+              <w:bottom w:type="dxa" w:w="70"/>
+              <w:right w:type="dxa" w:w="90"/>
+            </w:tcMar>
+            <w:vAlign w:val="center"/>
+          </w:tcPr>
+          <w:p>
+            <w:pPr>
+              <w:spacing w:after="0" w:before="0"/>
+            </w:pPr>
+            <w:r>
+              <w:rPr>
+                <w:b w:val="false"/>
+                <w:bCs w:val="false"/>
+                <w:color w:val="202B36"/>
+                <w:sz w:val="14"/>
+                <w:szCs w:val="14"/>
+              </w:rPr>
+              <w:t xml:space="preserve">Independent CLASS perturbation controls</w:t>
+            </w:r>
+          </w:p>
+        </w:tc>
+        <w:tc>
+          <w:tcPr>
+            <w:tcW w:type="dxa" w:w="4150"/>
+            <w:tcBorders>
+              <w:top w:val="single" w:color="A8B3C2" w:sz="2"/>
+              <w:left w:val="single" w:color="A8B3C2" w:sz="2"/>
+              <w:bottom w:val="single" w:color="A8B3C2" w:sz="2"/>
+              <w:right w:val="single" w:color="A8B3C2" w:sz="2"/>
+            </w:tcBorders>
+            <w:shd w:fill="FFFFFF" w:val="clear"/>
+            <w:tcMar>
+              <w:top w:type="dxa" w:w="70"/>
+              <w:left w:type="dxa" w:w="90"/>
+              <w:bottom w:type="dxa" w:w="70"/>
+              <w:right w:type="dxa" w:w="90"/>
+            </w:tcMar>
+            <w:vAlign w:val="center"/>
+          </w:tcPr>
+          <w:p>
+            <w:pPr>
+              <w:spacing w:after="0" w:before="0"/>
+            </w:pPr>
+            <w:r>
+              <w:rPr>
+                <w:b w:val="false"/>
+                <w:bCs w:val="false"/>
+                <w:color w:val="202B36"/>
+                <w:sz w:val="14"/>
+                <w:szCs w:val="14"/>
+              </w:rPr>
+              <w:t xml:space="preserve">exact-CDM and tighter-integration P(k), σ₈, and lensing differences below thresholds</w:t>
+            </w:r>
+          </w:p>
+        </w:tc>
+        <w:tc>
+          <w:tcPr>
+            <w:tcW w:type="dxa" w:w="2600"/>
+            <w:tcBorders>
+              <w:top w:val="single" w:color="A8B3C2" w:sz="2"/>
+              <w:left w:val="single" w:color="A8B3C2" w:sz="2"/>
+              <w:bottom w:val="single" w:color="A8B3C2" w:sz="2"/>
+              <w:right w:val="single" w:color="A8B3C2" w:sz="2"/>
+            </w:tcBorders>
+            <w:shd w:fill="FFFFFF" w:val="clear"/>
+            <w:tcMar>
+              <w:top w:type="dxa" w:w="70"/>
+              <w:left w:type="dxa" w:w="90"/>
+              <w:bottom w:type="dxa" w:w="70"/>
+              <w:right w:type="dxa" w:w="90"/>
+            </w:tcMar>
+            <w:vAlign w:val="center"/>
+          </w:tcPr>
+          <w:p>
+            <w:pPr>
+              <w:spacing w:after="0" w:before="0"/>
+            </w:pPr>
+            <w:r>
+              <w:rPr>
+                <w:b w:val="false"/>
+                <w:bCs w:val="false"/>
+                <w:color w:val="202B36"/>
+                <w:sz w:val="14"/>
+                <w:szCs w:val="14"/>
+              </w:rPr>
+              <w:t xml:space="preserve">PASS AT LINEAR EQUATION LEVEL</w:t>
+            </w:r>
+          </w:p>
+        </w:tc>
+      </w:tr>
+      <w:tr>
+        <w:trPr>
+          <w:cantSplit/>
+          <w:tblHeader w:val="false"/>
+        </w:trPr>
+        <w:tc>
+          <w:tcPr>
+            <w:tcW w:type="dxa" w:w="480"/>
+            <w:tcBorders>
+              <w:top w:val="single" w:color="A8B3C2" w:sz="2"/>
+              <w:left w:val="single" w:color="A8B3C2" w:sz="2"/>
+              <w:bottom w:val="single" w:color="A8B3C2" w:sz="2"/>
+              <w:right w:val="single" w:color="A8B3C2" w:sz="2"/>
+            </w:tcBorders>
+            <w:shd w:fill="F2F4F7" w:val="clear"/>
+            <w:tcMar>
+              <w:top w:type="dxa" w:w="70"/>
+              <w:left w:type="dxa" w:w="90"/>
+              <w:bottom w:type="dxa" w:w="70"/>
+              <w:right w:type="dxa" w:w="90"/>
+            </w:tcMar>
+            <w:vAlign w:val="center"/>
+          </w:tcPr>
+          <w:p>
+            <w:pPr>
+              <w:spacing w:after="0" w:before="0"/>
+            </w:pPr>
+            <w:r>
+              <w:rPr>
+                <w:b w:val="false"/>
+                <w:bCs w:val="false"/>
+                <w:color w:val="202B36"/>
+                <w:sz w:val="14"/>
+                <w:szCs w:val="14"/>
+              </w:rPr>
+              <w:t xml:space="preserve">34</w:t>
+            </w:r>
+          </w:p>
+        </w:tc>
+        <w:tc>
+          <w:tcPr>
+            <w:tcW w:type="dxa" w:w="2450"/>
+            <w:tcBorders>
+              <w:top w:val="single" w:color="A8B3C2" w:sz="2"/>
+              <w:left w:val="single" w:color="A8B3C2" w:sz="2"/>
+              <w:bottom w:val="single" w:color="A8B3C2" w:sz="2"/>
+              <w:right w:val="single" w:color="A8B3C2" w:sz="2"/>
+            </w:tcBorders>
+            <w:shd w:fill="F2F4F7" w:val="clear"/>
+            <w:tcMar>
+              <w:top w:type="dxa" w:w="70"/>
+              <w:left w:type="dxa" w:w="90"/>
+              <w:bottom w:type="dxa" w:w="70"/>
+              <w:right w:type="dxa" w:w="90"/>
+            </w:tcMar>
+            <w:vAlign w:val="center"/>
+          </w:tcPr>
+          <w:p>
+            <w:pPr>
+              <w:spacing w:after="0" w:before="0"/>
+            </w:pPr>
+            <w:r>
+              <w:rPr>
+                <w:b w:val="false"/>
+                <w:bCs w:val="false"/>
+                <w:color w:val="202B36"/>
+                <w:sz w:val="14"/>
+                <w:szCs w:val="14"/>
+              </w:rPr>
+              <w:t xml:space="preserve">DDM compressed SDSS full-shape/growth prediction</w:t>
+            </w:r>
+          </w:p>
+        </w:tc>
+        <w:tc>
+          <w:tcPr>
+            <w:tcW w:type="dxa" w:w="4150"/>
+            <w:tcBorders>
+              <w:top w:val="single" w:color="A8B3C2" w:sz="2"/>
+              <w:left w:val="single" w:color="A8B3C2" w:sz="2"/>
+              <w:bottom w:val="single" w:color="A8B3C2" w:sz="2"/>
+              <w:right w:val="single" w:color="A8B3C2" w:sz="2"/>
+            </w:tcBorders>
+            <w:shd w:fill="F2F4F7" w:val="clear"/>
+            <w:tcMar>
+              <w:top w:type="dxa" w:w="70"/>
+              <w:left w:type="dxa" w:w="90"/>
+              <w:bottom w:type="dxa" w:w="70"/>
+              <w:right w:type="dxa" w:w="90"/>
+            </w:tcMar>
+            <w:vAlign w:val="center"/>
+          </w:tcPr>
+          <w:p>
+            <w:pPr>
+              <w:spacing w:after="0" w:before="0"/>
+            </w:pPr>
+            <w:r>
+              <w:rPr>
+                <w:b w:val="false"/>
+                <w:bCs w:val="false"/>
+                <w:color w:val="202B36"/>
+                <w:sz w:val="14"/>
+                <w:szCs w:val="14"/>
+              </w:rPr>
+              <w:t xml:space="preserve">source vectors: full p=0.0128/0.00181; growth p=0.00302/0.000368; amplitude rescue requires σ₈=0.918/0.931</w:t>
+            </w:r>
+          </w:p>
+        </w:tc>
+        <w:tc>
+          <w:tcPr>
+            <w:tcW w:type="dxa" w:w="2600"/>
+            <w:tcBorders>
+              <w:top w:val="single" w:color="A8B3C2" w:sz="2"/>
+              <w:left w:val="single" w:color="A8B3C2" w:sz="2"/>
+              <w:bottom w:val="single" w:color="A8B3C2" w:sz="2"/>
+              <w:right w:val="single" w:color="A8B3C2" w:sz="2"/>
+            </w:tcBorders>
+            <w:shd w:fill="F2F4F7" w:val="clear"/>
+            <w:tcMar>
+              <w:top w:type="dxa" w:w="70"/>
+              <w:left w:type="dxa" w:w="90"/>
+              <w:bottom w:type="dxa" w:w="70"/>
+              <w:right w:type="dxa" w:w="90"/>
+            </w:tcMar>
+            <w:vAlign w:val="center"/>
+          </w:tcPr>
+          <w:p>
+            <w:pPr>
+              <w:spacing w:after="0" w:before="0"/>
+            </w:pPr>
+            <w:r>
+              <w:rPr>
+                <w:b w:val="false"/>
+                <w:bCs w:val="false"/>
+                <w:color w:val="202B36"/>
+                <w:sz w:val="14"/>
+                <w:szCs w:val="14"/>
+              </w:rPr>
+              <w:t xml:space="preserve">SUBSTANTIAL FALSIFICATION PRESSURE; NATIVE REFIT OPEN</w:t>
+            </w:r>
+          </w:p>
+        </w:tc>
+      </w:tr>
+      <w:tr>
+        <w:trPr>
+          <w:cantSplit/>
+          <w:tblHeader w:val="false"/>
+        </w:trPr>
+        <w:tc>
+          <w:tcPr>
+            <w:tcW w:type="dxa" w:w="480"/>
+            <w:tcBorders>
+              <w:top w:val="single" w:color="A8B3C2" w:sz="2"/>
+              <w:left w:val="single" w:color="A8B3C2" w:sz="2"/>
+              <w:bottom w:val="single" w:color="A8B3C2" w:sz="2"/>
+              <w:right w:val="single" w:color="A8B3C2" w:sz="2"/>
+            </w:tcBorders>
+            <w:shd w:fill="FFFFFF" w:val="clear"/>
+            <w:tcMar>
+              <w:top w:type="dxa" w:w="70"/>
+              <w:left w:type="dxa" w:w="90"/>
+              <w:bottom w:type="dxa" w:w="70"/>
+              <w:right w:type="dxa" w:w="90"/>
+            </w:tcMar>
+            <w:vAlign w:val="center"/>
+          </w:tcPr>
+          <w:p>
+            <w:pPr>
+              <w:spacing w:after="0" w:before="0"/>
+            </w:pPr>
+            <w:r>
+              <w:rPr>
+                <w:b w:val="false"/>
+                <w:bCs w:val="false"/>
+                <w:color w:val="202B36"/>
+                <w:sz w:val="14"/>
+                <w:szCs w:val="14"/>
+              </w:rPr>
+              <w:t xml:space="preserve">35</w:t>
+            </w:r>
+          </w:p>
+        </w:tc>
+        <w:tc>
+          <w:tcPr>
+            <w:tcW w:type="dxa" w:w="2450"/>
+            <w:tcBorders>
+              <w:top w:val="single" w:color="A8B3C2" w:sz="2"/>
+              <w:left w:val="single" w:color="A8B3C2" w:sz="2"/>
+              <w:bottom w:val="single" w:color="A8B3C2" w:sz="2"/>
+              <w:right w:val="single" w:color="A8B3C2" w:sz="2"/>
+            </w:tcBorders>
+            <w:shd w:fill="FFFFFF" w:val="clear"/>
+            <w:tcMar>
+              <w:top w:type="dxa" w:w="70"/>
+              <w:left w:type="dxa" w:w="90"/>
+              <w:bottom w:type="dxa" w:w="70"/>
+              <w:right w:type="dxa" w:w="90"/>
+            </w:tcMar>
+            <w:vAlign w:val="center"/>
+          </w:tcPr>
+          <w:p>
+            <w:pPr>
+              <w:spacing w:after="0" w:before="0"/>
+            </w:pPr>
+            <w:r>
+              <w:rPr>
+                <w:b w:val="false"/>
+                <w:bCs w:val="false"/>
+                <w:color w:val="202B36"/>
+                <w:sz w:val="14"/>
+                <w:szCs w:val="14"/>
+              </w:rPr>
+              <w:t xml:space="preserve">DDM CMB-lensing prediction</w:t>
+            </w:r>
+          </w:p>
+        </w:tc>
+        <w:tc>
+          <w:tcPr>
+            <w:tcW w:type="dxa" w:w="4150"/>
+            <w:tcBorders>
+              <w:top w:val="single" w:color="A8B3C2" w:sz="2"/>
+              <w:left w:val="single" w:color="A8B3C2" w:sz="2"/>
+              <w:bottom w:val="single" w:color="A8B3C2" w:sz="2"/>
+              <w:right w:val="single" w:color="A8B3C2" w:sz="2"/>
+            </w:tcBorders>
+            <w:shd w:fill="FFFFFF" w:val="clear"/>
+            <w:tcMar>
+              <w:top w:type="dxa" w:w="70"/>
+              <w:left w:type="dxa" w:w="90"/>
+              <w:bottom w:type="dxa" w:w="70"/>
+              <w:right w:type="dxa" w:w="90"/>
+            </w:tcMar>
+            <w:vAlign w:val="center"/>
+          </w:tcPr>
+          <w:p>
+            <w:pPr>
+              <w:spacing w:after="0" w:before="0"/>
+            </w:pPr>
+            <w:r>
+              <w:rPr>
+                <w:b w:val="false"/>
+                <w:bCs w:val="false"/>
+                <w:color w:val="202B36"/>
+                <w:sz w:val="14"/>
+                <w:szCs w:val="14"/>
+              </w:rPr>
+              <w:t xml:space="preserve">linear amplitude ratios 0.87/0.79 and 0.85/0.76 vs matched ΛCDM</w:t>
+            </w:r>
+          </w:p>
+        </w:tc>
+        <w:tc>
+          <w:tcPr>
+            <w:tcW w:type="dxa" w:w="2600"/>
+            <w:tcBorders>
+              <w:top w:val="single" w:color="A8B3C2" w:sz="2"/>
+              <w:left w:val="single" w:color="A8B3C2" w:sz="2"/>
+              <w:bottom w:val="single" w:color="A8B3C2" w:sz="2"/>
+              <w:right w:val="single" w:color="A8B3C2" w:sz="2"/>
+            </w:tcBorders>
+            <w:shd w:fill="FFFFFF" w:val="clear"/>
+            <w:tcMar>
+              <w:top w:type="dxa" w:w="70"/>
+              <w:left w:type="dxa" w:w="90"/>
+              <w:bottom w:type="dxa" w:w="70"/>
+              <w:right w:type="dxa" w:w="90"/>
+            </w:tcMar>
+            <w:vAlign w:val="center"/>
+          </w:tcPr>
+          <w:p>
+            <w:pPr>
+              <w:spacing w:after="0" w:before="0"/>
+            </w:pPr>
+            <w:r>
+              <w:rPr>
+                <w:b w:val="false"/>
+                <w:bCs w:val="false"/>
+                <w:color w:val="202B36"/>
+                <w:sz w:val="14"/>
+                <w:szCs w:val="14"/>
+              </w:rPr>
+              <w:t xml:space="preserve">FALSIFIABLE PREDICTION; NATIVE LIKELIHOOD OPEN</w:t>
+            </w:r>
+          </w:p>
+        </w:tc>
+      </w:tr>
     </w:tbl>
     <w:p>
       <w:pPr>
@@ -6178,7 +7764,7 @@
         <w:jc w:val="both"/>
       </w:pPr>
       <w:r>
-        <w:t xml:space="preserve">Code, data-download instructions, results, chains, and the pre-registered hypothesis chain: https://github.com/GrobeStreet/de-stress-lab (v1.0, MIT). Archived with DOI via Zenodo.</w:t>
+        <w:t xml:space="preserve">Code, data-download instructions, results, chains, and the pre-registered hypothesis chain: https://github.com/GrobeStreet/de-stress-lab (MIT). A human clean-room execution of the July DDM gate remains pending.</w:t>
       </w:r>
     </w:p>
     <w:sectPr>

</xml_diff>

<commit_message>
Build DESI evidence review package
</commit_message>
<xml_diff>
--- a/whitepaper.docx
+++ b/whitepaper.docx
@@ -178,7 +178,7 @@
         <w:jc w:val="both"/>
       </w:pPr>
       <w:r>
-        <w:t xml:space="preserve">We independently reimplement the compressed likelihoods behind the DESI DR2 preference for evolving dark energy (w₀wₐCDM over ΛCDM) and subject the result to influence diagnostics, calibration stress tests, parameterization swaps, parametric bootstraps, a comparator-measurement swap test, full-Boltzmann (CAMB) verification, and posterior sampling under the collaboration's own priors. We reproduce the published Δχ²_MAP ladder (−4.7/−4.9/−8.0 published vs −4.7/−5.1/−8.5 here), marginalized posteriors (w₀ = −0.45 +0.24/−0.23, wₐ = −1.66 +0.65/−0.71 vs published −0.42 ± 0.21, −1.75 ± 0.58), the w₀–wₐ posterior correlation (−0.978 vs −0.975), and ΔDIC (−4.96 vs −4.4). We then find the preference is sharply localized. Removing the single LRG2 (z = 0.706) BAO measurement collapses the compressed-CMB preference from 2.4σ to 1.6σ (full CAMB: 2.41σ → 1.53σ). Substituting the earlier eBOSS DR16 measurement at the same redshift — a lower-precision, partially sample- and footprint-correlated comparator, not an independent experiment — yields a preference identical to having no measurement there. The z ≈ 0.7 anomaly changed observable between DESI's releases — transverse (D_M) in DR1, radial (D_H) in DR2. A selection-calibrated test repeats all seven tracer deletions inside each of 5,000 ΛCDM mocks. The observed maximum loss of preference is M = 4.125 in Δχ², at LRG2; 78/5,000 null mocks have an equal-or-larger selected maximum, p = 0.0156 [0.0124, 0.0194]. However, among the 70 null mocks whose global w₀wₐ preference is at least as strong as observed, 34 have an equal-or-larger maximum, p_cond = 0.486 [0.364, 0.608]. LRG2 is therefore descriptively load-bearing, but the concentration is not exceptional conditional on a global fluctuation of this strength. A held-out ΛCDM fit predicts LRG2 at joint p = 0.0408 (2.05σ); the discrepancy is mainly in the isotropic distance D_V/r_d (p = 0.0204), while the Alcock–Paczynski ratio is ordinary (p = 0.374). On the supernova side, a single free magnitude offset on the DES5Y external low-z sample fits at +0.036 mag and reduces the DESI+DES5Y preference from 2.2σ to 0.2σ (1.3σ with the CMB anchor); this is a degeneracy test, not a calibration diagnosis. Evolving families outperform constant w, but the direct question is calibrated separately: in DESI+cCMB, CPL w₀wₐCDM improves over wCDM by T = 7.851, with 30/5,000 constant-w mocks as large, p = 0.0060 [0.0041, 0.0086] (2.75σ). Removing LRG2 reduces this direct time-variation test to T = 3.426, p = 0.0698 [0.0629, 0.0772] (1.81σ). A separate global ΛCDM bootstrap gives p = 0.0140 [0.0109, 0.0177], consistent with Wilks. A pre-registered cross-probe consistency test returned an INTERMEDIATE verdict. Finally, a full-CMB variant including lensing (PR3-native likelihoods) gives Δχ² = −10.35 (2.77σ) with LRG2 and −3.76 (1.43σ) without it. We also gate the July 2026 dynamical-dark-matter reinterpretation. Its exact background gives Δχ² = −5.861 on the same DESI+cCMB geometry data, but 354/5,000 ΛCDM mocks do at least as well (p = 0.0708); CPL fits better, the DDM optimum lies on its equation-of-state prior wall, and LRG2 removal reduces the statistic to 3.461. Repeating all seven DDM deletions inside the 354 equally strong global null mocks gives 216 equal-or-larger selected influences, p_cond = 0.610 [0.557, 0.661], so its localization is ordinary conditional on the global fluctuation. In DESI+cCMB+DES5Y, a matched non-regular bootstrap gives p=0.0122 [0.00934,0.01564], but a separately calibrated low-z-offset branch gives p=0.0934 [0.0855,0.1018]. An independent CLASS implementation of the published linear perturbations passes exact-CDM controls, reproduces the reported low S₈, and then places the two published mean vectors under substantial pressure from a public SDSS DR16 compressed full-shape/growth vector (fixed-vector full p=0.0128 and 0.00181; growth-only p=0.00302 and 0.000368). Native nonlinear full-shape and lensing likelihood refits remain open. We conclude that the compressed likelihood contains a calibrated, CPL-specific hint of time variation, but neither it nor the DDM reinterpretation constitutes a discovery. A hint, precisely mapped.</w:t>
+        <w:t xml:space="preserve">We independently reimplement the compressed likelihoods behind the DESI DR2 preference for evolving dark energy (w₀wₐCDM over ΛCDM) and subject the result to influence diagnostics, calibration stress tests, parameterization swaps, parametric bootstraps, a comparator-measurement swap test, full-Boltzmann (CAMB) verification, and posterior sampling under the collaboration's own priors. We reproduce the published Δχ²_MAP ladder (−4.7/−4.9/−8.0 published vs −4.7/−5.1/−8.5 here), marginalized posteriors (w₀ = −0.45 +0.24/−0.23, wₐ = −1.66 +0.65/−0.71 vs published −0.42 ± 0.21, −1.75 ± 0.58), the w₀–wₐ posterior correlation (−0.978 vs −0.975), and ΔDIC (−4.96 vs −4.4). We then find the preference is sharply localized. Removing the single LRG2 (z = 0.706) BAO measurement collapses the compressed-CMB preference from 2.4σ to 1.6σ (full CAMB: 2.41σ → 1.53σ). Substituting the earlier eBOSS DR16 measurement at the same redshift — a lower-precision, partially sample- and footprint-correlated comparator, not an independent experiment — yields a preference identical to having no measurement there. The z ≈ 0.7 anomaly changed observable between DESI's releases — transverse (D_M) in DR1, radial (D_H) in DR2. A selection-calibrated test repeats all seven tracer deletions inside each of 5,000 ΛCDM mocks. The observed maximum loss of preference is M = 4.125 in Δχ², at LRG2; 78/5,000 null mocks have an equal-or-larger selected maximum, p = 0.0156 [0.0124, 0.0194]. However, among the 70 null mocks whose global w₀wₐ preference is at least as strong as observed, 34 have an equal-or-larger maximum, p_cond = 0.486 [0.364, 0.608]. LRG2 is therefore descriptively load-bearing, but the concentration is not exceptional conditional on a global fluctuation of this strength. A held-out ΛCDM fit predicts LRG2 at joint p = 0.0408 (2.05σ); the discrepancy is mainly in the isotropic distance D_V/r_d (p = 0.0204), while the Alcock–Paczynski ratio is ordinary (p = 0.374). On the supernova side, a single free magnitude offset on the DES5Y external low-z sample fits at +0.036 mag and reduces the DESI+DES5Y preference from 2.2σ to 0.2σ (1.3σ with the CMB anchor); this is a degeneracy test, not a calibration diagnosis. Evolving families outperform constant w, but the direct question is calibrated separately: in DESI+cCMB, CPL w₀wₐCDM improves over wCDM by T = 7.851, with 30/5,000 constant-w mocks as large, p = 0.0060 [0.0041, 0.0086] (2.75σ). Removing LRG2 reduces this direct time-variation test to T = 3.426, p = 0.0698 [0.0629, 0.0772] (1.81σ). A separate global ΛCDM bootstrap gives p = 0.0140 [0.0109, 0.0177], consistent with Wilks. A pre-registered cross-probe consistency test returned an INTERMEDIATE verdict. Finally, a full-CMB variant including lensing (PR3-native likelihoods) gives Δχ² = −10.35 (2.77σ) with LRG2 and −3.76 (1.43σ) without it. We conclude that the compressed likelihood contains a calibrated, CPL-specific hint of time variation, but its strength remains LRG2-sensitive and the selected localization is ordinary among equally strong ΛCDM fluctuations. A hint, precisely mapped; not a discovery.</w:t>
       </w:r>
     </w:p>
     <w:p>
@@ -1321,7 +1321,7 @@
         <w:keepNext/>
       </w:pPr>
       <w:r>
-        <w:t xml:space="preserve">9. July 2026 dynamical-dark-matter gate</w:t>
+        <w:t xml:space="preserve">9. What this establishes — and what it does not</w:t>
       </w:r>
     </w:p>
     <w:p>
@@ -1330,71 +1330,14 @@
         <w:jc w:val="both"/>
       </w:pPr>
       <w:r>
-        <w:t xml:space="preserve">After Ajith and Kumar proposed that the DESI preference could arise from a dark-matter equation of state that changes from an early asymptote wₐᵈᵐ to a late asymptote w₀ᵈᵐ, we independently derived and implemented their exact homogeneous density evolution. The CDM null is recovered exactly. On DESI+cCMB, the geometry screen gives Δχ²_DDM−Λ = −5.861, within 0.697 of their −6.558 result on a different, full-CMB likelihood stack. This is a successful background-level reproduction, not a reproduction of their unpublished modified-CAMB perturbation implementation.</w:t>
-      </w:r>
-    </w:p>
-    <w:p>
-      <w:pPr>
-        <w:widowControl/>
-        <w:jc w:val="both"/>
-      </w:pPr>
-      <w:r>
-        <w:t xml:space="preserve">The identical-data comparison does not select DDM. The minimum χ² values are 15.578 (ΛCDM), 14.971 (constant-w), 7.120 (CPL), and 9.717 (DDM); descriptive AIC values are 21.578, 22.971, 17.120, and 21.717, respectively. CPL fits DDM better by 2.596 in χ². The DDM optimum has Ωm = 0.3546, h = 0.6821, wₐᵈᵐ = 0.001278, a_t = 0.551, and w₀ᵈᵐ = −0.1000 — exactly the source prior's lower wall. Repeating the fit with ±0.05, ±0.10, and ±0.20 EoS boxes moves the optimum to −0.05, −0.10, and −0.20 while T changes only 5.681 → 5.861 → 6.024. The raw fit improvement is fairly stable, but the inferred late-time EoS is not a prior-stable measurement.</w:t>
-      </w:r>
-    </w:p>
-    <w:p>
-      <w:pPr>
-        <w:widowControl/>
-        <w:jc w:val="both"/>
-      </w:pPr>
-      <w:r>
-        <w:t xml:space="preserve">Because a_t is unidentified when w₀ᵈᵐ = wₐᵈᵐ = 0, Wilks' theorem is not used. Repeating the complete DDM search in 5,000 fitted-ΛCDM mocks gives 354 values at least as large as T_obs = 5.861: p = 0.0708 [0.0638, 0.0783], equivalent to 1.47σ one-sided or 1.81σ under a two-sided convention. All final fits converged; 3,219/5,000 null fits reached a source-prior boundary. Across the seven observed tracer deletions, only LRG2 weakens DDM materially: T = 3.461, a loss of 2.400, while all six other deletions slightly strengthen it. This is less concentrated than CPL's 4.125 loss, but it points in the same pre-identified direction. The matched no-LRG2 bootstrap gives 1,139/5,000, p = 0.2278 [0.2162, 0.2397] (0.75σ one-sided; 1.21σ two-sided). To calibrate selection, all seven deletions were then repeated inside every one of the 354 null mocks whose global DDM statistic was at least as large as observed. Of those, 216 have a selected maximum influence at least as large as LRG2's 2.400: p_cond = 0.6102 [0.5572, 0.6613]. The null median maximum is 2.851, larger than observed, and LRG2 is selected in only 22/354 mocks. LRG2 was a registered target before this DDM analysis, but the calibrated result is stronger: its observed leverage is not exceptional conditional on the global fluctuation.</w:t>
-      </w:r>
-    </w:p>
-    <w:p>
-      <w:pPr>
-        <w:widowControl/>
-        <w:jc w:val="both"/>
-      </w:pPr>
-      <w:r>
-        <w:t xml:space="preserve">The low-redshift supernova seam also matters without fully absorbing DDM. On the 2025 Dovekie DES5Y release, DESI+cCMB+DES5Y gives T_DDM = 9.603. Because a_t is unidentified under ΛCDM, a matched 5,000-mock bootstrap—not Wilks—sets the significance: 61/5,000 mocks are equal or larger, p=0.0122 [0.00934,0.01564] (2.25σ one-sided). Freeing one offset for the external low-z sample fits +0.0315 mag and reduces T to 5.358. A second bootstrap uses that branch's own fitted ΛCDM null and identical nuisance projection: 467/5,000, p=0.0934 [0.0855,0.1018] (1.32σ one-sided). Both runs had zero optimizer failures. Counting the magnitude nuisances, all four offset models fall within 1.45 descriptive AIC units and ΛCDM has the lowest value. The calibration freedom therefore moves the DDM preference from an interesting combined-data hint to a statistically ordinary result. This establishes dependence on the calibration model, not that the calibration is wrong.</w:t>
-      </w:r>
-    </w:p>
-    <w:p>
-      <w:pPr>
-        <w:widowControl/>
-        <w:jc w:val="both"/>
-      </w:pPr>
-      <w:r>
-        <w:t xml:space="preserve">The physical-growth gate is not passed. Because the source's modified CAMB code is unavailable, we independently patched pinned public CLASS v3.3.4 with the published synchronous-gauge, zero-sound-speed, zero-shear fluid equations. Exact-CDM nesting agrees with stock CLASS to 2.8×10⁻⁵ in σ₈, 2.5×10⁻⁴ in linear P(k), and 1.4×10⁻⁴ in CMB lensing; a tighter-integration rerun is stable. The source CMB+DESI+DESY5 and +G17 mean vectors reproduce (σ₈,S₈)=(0.728,0.793) and (0.708,0.775), close to the paper. Against the public correlated SDSS DR16 compressed (D_M/r_d,D_H/r_d,fσ₈) vector, however, the fixed source vectors give χ²=20.97/9 (p=0.0128) and 26.32/9 (p=0.00181), with growth-only χ²=13.92/3 (p=0.00302) and 18.37/3 (p=0.000368). Matched ΛCDM controls give full-vector p=0.162 and 0.096. Profiling only primordial amplitude can repair the growth residuals, but requires σ₈=0.918 or 0.931 and a 33–39-source-error shift in ln(10¹⁰A_s), eliminating the proposed low-growth benefit. Linear CMB-lensing power is suppressed to 0.87/0.79 and 0.85/0.76 of matched ΛCDM at low/high multipoles, a prediction rather than a likelihood result.</w:t>
-      </w:r>
-    </w:p>
-    <w:p>
-      <w:pPr>
-        <w:widowControl/>
-        <w:jc w:val="left"/>
-      </w:pPr>
-      <w:r>
-        <w:t xml:space="preserve">These are independently reproducible equation-level and fixed-vector tests, not a native nonlinear DESI full-shape/EFT refit or an ACT/Planck/weak-lensing likelihood evaluation. SDSS partly overlaps DESI, and cosmological and galaxy-bias parameters were not reoptimized. The result is therefore substantial falsification pressure, not a formal model-family exclusion. The complete source-audited gate is </w:t>
-      </w:r>
-      <w:r>
-        <w:rPr>
-          <w:rFonts w:ascii="Courier New" w:cs="Courier New" w:eastAsia="Courier New" w:hAnsi="Courier New"/>
-          <w:color w:val="334155"/>
-          <w:sz w:val="18"/>
-          <w:szCs w:val="18"/>
-        </w:rPr>
-        <w:t xml:space="preserve">DDM_FRONTIER_GATE.md</w:t>
-      </w:r>
-      <w:r>
-        <w:t xml:space="preserve">. </w:t>
+        <w:t xml:space="preserve">Established: the published compressed likelihoods genuinely contain the reported preference; it survives independent reimplementation, optimizer attack, full Boltzmann physics, parameterization changes, and bootstrap calibration. Within CPL, a direct constant-w null test gives a calibrated 2.75σ preference for time variation, falling to 1.81σ without LRG2. The held-out LRG2 vector is a modest 2.05σ discrepancy, driven more by isotropic distance scale than by its shape ratio. Among ΛCDM mocks with a global preference this strong, a maximum deletion influence at least as large as observed occurs about half the time. Not established: that dark energy evolves; that LRG2 is wrong; that localization or the targeted held-out p-value is independent evidence; that the supernova calibration explanation is correct; or that the PR3-native full-CMB variant reproduces DESI's PR4/ACT stack. The honest status is </w:t>
       </w:r>
       <w:r>
         <w:rPr>
           <w:b/>
           <w:bCs/>
         </w:rPr>
-        <w:t xml:space="preserve">Canonical verdict: the DDM background is a reproducible alternate fit to the anomaly, but its supernova significance is calibration-dependent and its published mean vectors face adverse growth/full-shape predictions; the physical dark-matter claim fails promotion.</w:t>
+        <w:t xml:space="preserve">a reproducible, LRG2-sensitive 2–3σ hint — not proof.</w:t>
       </w:r>
     </w:p>
     <w:p>
@@ -1403,32 +1346,7 @@
         <w:keepNext/>
       </w:pPr>
       <w:r>
-        <w:t xml:space="preserve">10. What this establishes — and what it does not</w:t>
-      </w:r>
-    </w:p>
-    <w:p>
-      <w:pPr>
-        <w:widowControl/>
-        <w:jc w:val="both"/>
-      </w:pPr>
-      <w:r>
-        <w:t xml:space="preserve">Established: the published compressed likelihoods genuinely contain the reported preference; it survives independent reimplementation, optimizer attack, full Boltzmann physics, parameterization changes, and bootstrap calibration. Within CPL, a direct constant-w null test gives a calibrated 2.75σ preference for time variation, falling to 1.81σ without LRG2. The held-out LRG2 vector is a modest 2.05σ discrepancy, driven more by isotropic distance scale than by its shape ratio. Among ΛCDM mocks with a global preference this strong, a maximum deletion influence at least as large as observed occurs about half the time for CPL and 61% of the time for DDM. The July DDM background can reproduce much of the same geometry improvement, and its baseline DES5Y combination reaches p=0.0122; but its ordinary conditional localization, prior-wall optimum, worse fit than CPL, offset-branch p=0.0934, and adverse fixed-vector growth/full-shape predictions prevent promotion. Not established: that dark energy evolves; that dark matter has negative pressure; that LRG2 is wrong; that localization or the targeted held-out p-value is independent evidence; that the supernova calibration explanation is correct; that the fixed-vector SDSS check is a native nonlinear model-family exclusion; or that the PR3-native full-CMB variant reproduces DESI's PR4/ACT stack. The honest status is </w:t>
-      </w:r>
-      <w:r>
-        <w:rPr>
-          <w:b/>
-          <w:bCs/>
-        </w:rPr>
-        <w:t xml:space="preserve">a reproducible, LRG2-sensitive 2–3σ dark-energy hint and a DDM reinterpretation that now fails both calibration-identifiability and physical-prediction gates — not proof of either.</w:t>
-      </w:r>
-    </w:p>
-    <w:p>
-      <w:pPr>
-        <w:pStyle w:val="Heading1"/>
-        <w:keepNext/>
-      </w:pPr>
-      <w:r>
-        <w:t xml:space="preserve">11. Frontier-standard boundary and development roadmap</w:t>
+        <w:t xml:space="preserve">10. Frontier-standard boundary and development roadmap</w:t>
       </w:r>
     </w:p>
     <w:p>
@@ -2042,7 +1960,7 @@
                 <w:sz w:val="16"/>
                 <w:szCs w:val="16"/>
               </w:rPr>
-              <w:t xml:space="preserve">Adverse fixed-vector DDM test; native likelihoods open</w:t>
+              <w:t xml:space="preserve">Open</w:t>
             </w:r>
           </w:p>
         </w:tc>
@@ -2275,7 +2193,7 @@
         <w:keepNext/>
       </w:pPr>
       <w:r>
-        <w:t xml:space="preserve">12. Falsifiable expectations</w:t>
+        <w:t xml:space="preserve">11. Falsifiable expectations</w:t>
       </w:r>
     </w:p>
     <w:p>
@@ -2284,7 +2202,7 @@
         <w:jc w:val="both"/>
       </w:pPr>
       <w:r>
-        <w:t xml:space="preserve">If the signal is dynamical dark energy: DESI's final likelihood (2027) retains the z ≈ 0.7 distance-scale departure at higher precision; Rubin-calibrated supernovae reproduce the low-z crossing with no magnitude offset required; growth and lensing co-vary as that model predicts. If the July DDM interpretation is physical: a native nonlinear full-shape refit must overcome the low fixed-vector fσ₈ predictions; ACT/Planck lensing must tolerate the predicted linear lensing suppression; native shear likelihoods must favor the same transition rather than merely a low S₈ summary; the EoS posterior must stop tracking its prior wall; and nonlinear halo and dwarf-galaxy formation must remain viable. If the anomaly is systematic: the LRG2 distance residual regresses; the supernova preference tracks calibration choices across compilations; residuals decorrelate across probes. We pre-commit to updating this document against those outcomes.</w:t>
+        <w:t xml:space="preserve">If the signal is physics: DESI's final likelihood (2027) retains the z ≈ 0.7 distance-scale departure at higher precision; Rubin-calibrated supernovae reproduce the low-z crossing with no magnitude offset required; growth and lensing co-vary as dynamical dark energy predicts. If it is systematics: the LRG2 distance residual regresses; the supernova preference tracks calibration choices across compilations; residuals decorrelate across probes. We pre-commit to updating this document against those outcomes.</w:t>
       </w:r>
     </w:p>
     <w:p>
@@ -2350,18 +2268,6 @@
         <w:t xml:space="preserve">python3 scripts/lrg2_posterior_predictive.py --mocks 5000 --workers 8 --fresh</w:t>
       </w:r>
       <w:r>
-        <w:t xml:space="preserve">. The complete DDM gate, including both 5,000-mock DES5Y calibrations and the pinned CLASS build, is </w:t>
-      </w:r>
-      <w:r>
-        <w:rPr>
-          <w:rFonts w:ascii="Courier New" w:cs="Courier New" w:eastAsia="Courier New" w:hAnsi="Courier New"/>
-          <w:color w:val="334155"/>
-          <w:sz w:val="18"/>
-          <w:szCs w:val="18"/>
-        </w:rPr>
-        <w:t xml:space="preserve">cleanroom/run_ddm_gate.sh 5000 8 cleanroom/ddm-verification</w:t>
-      </w:r>
-      <w:r>
         <w:t xml:space="preserve">. Results ship as JSON in </w:t>
       </w:r>
       <w:r>
@@ -2510,78 +2416,6 @@
       </w:pPr>
       <w:r>
         <w:t xml:space="preserve">Cortês and Liddle, “Interpreting DESI’s evidence for evolving dark energy,” arXiv:2504.15336.</w:t>
-      </w:r>
-    </w:p>
-    <w:p>
-      <w:pPr>
-        <w:pStyle w:val="ListParagraph"/>
-        <w:numPr>
-          <w:ilvl w:val="0"/>
-          <w:numId w:val="2"/>
-        </w:numPr>
-      </w:pPr>
-      <w:r>
-        <w:t xml:space="preserve">Ajith and Kumar, “Cosmological consequences of a dynamical dark matter in the light of DESI DR2 measurements,” arXiv:2607.18234.</w:t>
-      </w:r>
-    </w:p>
-    <w:p>
-      <w:pPr>
-        <w:pStyle w:val="ListParagraph"/>
-        <w:numPr>
-          <w:ilvl w:val="0"/>
-          <w:numId w:val="2"/>
-        </w:numPr>
-      </w:pPr>
-      <w:r>
-        <w:t xml:space="preserve">DESI Collaboration, “DESI 2024 VII: Cosmological Constraints from the Full-Shape Modeling of Clustering Measurements,” arXiv:2411.12022.</w:t>
-      </w:r>
-    </w:p>
-    <w:p>
-      <w:pPr>
-        <w:pStyle w:val="ListParagraph"/>
-        <w:numPr>
-          <w:ilvl w:val="0"/>
-          <w:numId w:val="2"/>
-        </w:numPr>
-      </w:pPr>
-      <w:r>
-        <w:t xml:space="preserve">Bautista et al., “The Completed SDSS-IV extended Baryon Oscillation Spectroscopic Survey: measurement of the BAO and growth rate of structure of the luminous red galaxy sample from the anisotropic correlation function between redshifts 0.6 and 1,” arXiv:2007.08993.</w:t>
-      </w:r>
-    </w:p>
-    <w:p>
-      <w:pPr>
-        <w:pStyle w:val="ListParagraph"/>
-        <w:numPr>
-          <w:ilvl w:val="0"/>
-          <w:numId w:val="2"/>
-        </w:numPr>
-      </w:pPr>
-      <w:r>
-        <w:t xml:space="preserve">DES Collaboration, “Dark Energy Survey Year 6 Results: Cosmological Constraints from Galaxy Clustering and Weak Lensing,” arXiv:2601.14559.</w:t>
-      </w:r>
-    </w:p>
-    <w:p>
-      <w:pPr>
-        <w:pStyle w:val="ListParagraph"/>
-        <w:numPr>
-          <w:ilvl w:val="0"/>
-          <w:numId w:val="2"/>
-        </w:numPr>
-      </w:pPr>
-      <w:r>
-        <w:t xml:space="preserve">Kopp, Skordis, and Thomas, “An extensive investigation of the Generalised Dark Matter model,” arXiv:1605.00649.</w:t>
-      </w:r>
-    </w:p>
-    <w:p>
-      <w:pPr>
-        <w:pStyle w:val="ListParagraph"/>
-        <w:numPr>
-          <w:ilvl w:val="0"/>
-          <w:numId w:val="2"/>
-        </w:numPr>
-      </w:pPr>
-      <w:r>
-        <w:t xml:space="preserve">Blas, Lesgourgues, and Tram, “The Cosmic Linear Anisotropy Solving System (CLASS) II: Approximation schemes,” arXiv:1104.2933.</w:t>
       </w:r>
     </w:p>
     <w:p>
@@ -6323,1426 +6157,6 @@
           </w:p>
         </w:tc>
       </w:tr>
-      <w:tr>
-        <w:trPr>
-          <w:cantSplit/>
-          <w:tblHeader w:val="false"/>
-        </w:trPr>
-        <w:tc>
-          <w:tcPr>
-            <w:tcW w:type="dxa" w:w="480"/>
-            <w:tcBorders>
-              <w:top w:val="single" w:color="A8B3C2" w:sz="2"/>
-              <w:left w:val="single" w:color="A8B3C2" w:sz="2"/>
-              <w:bottom w:val="single" w:color="A8B3C2" w:sz="2"/>
-              <w:right w:val="single" w:color="A8B3C2" w:sz="2"/>
-            </w:tcBorders>
-            <w:shd w:fill="F2F4F7" w:val="clear"/>
-            <w:tcMar>
-              <w:top w:type="dxa" w:w="70"/>
-              <w:left w:type="dxa" w:w="90"/>
-              <w:bottom w:type="dxa" w:w="70"/>
-              <w:right w:type="dxa" w:w="90"/>
-            </w:tcMar>
-            <w:vAlign w:val="center"/>
-          </w:tcPr>
-          <w:p>
-            <w:pPr>
-              <w:spacing w:after="0" w:before="0"/>
-            </w:pPr>
-            <w:r>
-              <w:rPr>
-                <w:b w:val="false"/>
-                <w:bCs w:val="false"/>
-                <w:color w:val="202B36"/>
-                <w:sz w:val="14"/>
-                <w:szCs w:val="14"/>
-              </w:rPr>
-              <w:t xml:space="preserve">26</w:t>
-            </w:r>
-          </w:p>
-        </w:tc>
-        <w:tc>
-          <w:tcPr>
-            <w:tcW w:type="dxa" w:w="2450"/>
-            <w:tcBorders>
-              <w:top w:val="single" w:color="A8B3C2" w:sz="2"/>
-              <w:left w:val="single" w:color="A8B3C2" w:sz="2"/>
-              <w:bottom w:val="single" w:color="A8B3C2" w:sz="2"/>
-              <w:right w:val="single" w:color="A8B3C2" w:sz="2"/>
-            </w:tcBorders>
-            <w:shd w:fill="F2F4F7" w:val="clear"/>
-            <w:tcMar>
-              <w:top w:type="dxa" w:w="70"/>
-              <w:left w:type="dxa" w:w="90"/>
-              <w:bottom w:type="dxa" w:w="70"/>
-              <w:right w:type="dxa" w:w="90"/>
-            </w:tcMar>
-            <w:vAlign w:val="center"/>
-          </w:tcPr>
-          <w:p>
-            <w:pPr>
-              <w:spacing w:after="0" w:before="0"/>
-            </w:pPr>
-            <w:r>
-              <w:rPr>
-                <w:b w:val="false"/>
-                <w:bCs w:val="false"/>
-                <w:color w:val="202B36"/>
-                <w:sz w:val="14"/>
-                <w:szCs w:val="14"/>
-              </w:rPr>
-              <w:t xml:space="preserve">July 2026 DDM exact-background geometry reproduction</w:t>
-            </w:r>
-          </w:p>
-        </w:tc>
-        <w:tc>
-          <w:tcPr>
-            <w:tcW w:type="dxa" w:w="4150"/>
-            <w:tcBorders>
-              <w:top w:val="single" w:color="A8B3C2" w:sz="2"/>
-              <w:left w:val="single" w:color="A8B3C2" w:sz="2"/>
-              <w:bottom w:val="single" w:color="A8B3C2" w:sz="2"/>
-              <w:right w:val="single" w:color="A8B3C2" w:sz="2"/>
-            </w:tcBorders>
-            <w:shd w:fill="F2F4F7" w:val="clear"/>
-            <w:tcMar>
-              <w:top w:type="dxa" w:w="70"/>
-              <w:left w:type="dxa" w:w="90"/>
-              <w:bottom w:type="dxa" w:w="70"/>
-              <w:right w:type="dxa" w:w="90"/>
-            </w:tcMar>
-            <w:vAlign w:val="center"/>
-          </w:tcPr>
-          <w:p>
-            <w:pPr>
-              <w:spacing w:after="0" w:before="0"/>
-            </w:pPr>
-            <w:r>
-              <w:rPr>
-                <w:b w:val="false"/>
-                <w:bCs w:val="false"/>
-                <w:color w:val="202B36"/>
-                <w:sz w:val="14"/>
-                <w:szCs w:val="14"/>
-              </w:rPr>
-              <w:t xml:space="preserve">Δχ²_DDM−Λ = −5.861 vs source full-CMB −6.558; exact CDM nesting</w:t>
-            </w:r>
-          </w:p>
-        </w:tc>
-        <w:tc>
-          <w:tcPr>
-            <w:tcW w:type="dxa" w:w="2600"/>
-            <w:tcBorders>
-              <w:top w:val="single" w:color="A8B3C2" w:sz="2"/>
-              <w:left w:val="single" w:color="A8B3C2" w:sz="2"/>
-              <w:bottom w:val="single" w:color="A8B3C2" w:sz="2"/>
-              <w:right w:val="single" w:color="A8B3C2" w:sz="2"/>
-            </w:tcBorders>
-            <w:shd w:fill="F2F4F7" w:val="clear"/>
-            <w:tcMar>
-              <w:top w:type="dxa" w:w="70"/>
-              <w:left w:type="dxa" w:w="90"/>
-              <w:bottom w:type="dxa" w:w="70"/>
-              <w:right w:type="dxa" w:w="90"/>
-            </w:tcMar>
-            <w:vAlign w:val="center"/>
-          </w:tcPr>
-          <w:p>
-            <w:pPr>
-              <w:spacing w:after="0" w:before="0"/>
-            </w:pPr>
-            <w:r>
-              <w:rPr>
-                <w:b w:val="false"/>
-                <w:bCs w:val="false"/>
-                <w:color w:val="202B36"/>
-                <w:sz w:val="14"/>
-                <w:szCs w:val="14"/>
-              </w:rPr>
-              <w:t xml:space="preserve">PASS AT BACKGROUND-SCREEN LEVEL</w:t>
-            </w:r>
-          </w:p>
-        </w:tc>
-      </w:tr>
-      <w:tr>
-        <w:trPr>
-          <w:cantSplit/>
-          <w:tblHeader w:val="false"/>
-        </w:trPr>
-        <w:tc>
-          <w:tcPr>
-            <w:tcW w:type="dxa" w:w="480"/>
-            <w:tcBorders>
-              <w:top w:val="single" w:color="A8B3C2" w:sz="2"/>
-              <w:left w:val="single" w:color="A8B3C2" w:sz="2"/>
-              <w:bottom w:val="single" w:color="A8B3C2" w:sz="2"/>
-              <w:right w:val="single" w:color="A8B3C2" w:sz="2"/>
-            </w:tcBorders>
-            <w:shd w:fill="FFFFFF" w:val="clear"/>
-            <w:tcMar>
-              <w:top w:type="dxa" w:w="70"/>
-              <w:left w:type="dxa" w:w="90"/>
-              <w:bottom w:type="dxa" w:w="70"/>
-              <w:right w:type="dxa" w:w="90"/>
-            </w:tcMar>
-            <w:vAlign w:val="center"/>
-          </w:tcPr>
-          <w:p>
-            <w:pPr>
-              <w:spacing w:after="0" w:before="0"/>
-            </w:pPr>
-            <w:r>
-              <w:rPr>
-                <w:b w:val="false"/>
-                <w:bCs w:val="false"/>
-                <w:color w:val="202B36"/>
-                <w:sz w:val="14"/>
-                <w:szCs w:val="14"/>
-              </w:rPr>
-              <w:t xml:space="preserve">27</w:t>
-            </w:r>
-          </w:p>
-        </w:tc>
-        <w:tc>
-          <w:tcPr>
-            <w:tcW w:type="dxa" w:w="2450"/>
-            <w:tcBorders>
-              <w:top w:val="single" w:color="A8B3C2" w:sz="2"/>
-              <w:left w:val="single" w:color="A8B3C2" w:sz="2"/>
-              <w:bottom w:val="single" w:color="A8B3C2" w:sz="2"/>
-              <w:right w:val="single" w:color="A8B3C2" w:sz="2"/>
-            </w:tcBorders>
-            <w:shd w:fill="FFFFFF" w:val="clear"/>
-            <w:tcMar>
-              <w:top w:type="dxa" w:w="70"/>
-              <w:left w:type="dxa" w:w="90"/>
-              <w:bottom w:type="dxa" w:w="70"/>
-              <w:right w:type="dxa" w:w="90"/>
-            </w:tcMar>
-            <w:vAlign w:val="center"/>
-          </w:tcPr>
-          <w:p>
-            <w:pPr>
-              <w:spacing w:after="0" w:before="0"/>
-            </w:pPr>
-            <w:r>
-              <w:rPr>
-                <w:b w:val="false"/>
-                <w:bCs w:val="false"/>
-                <w:color w:val="202B36"/>
-                <w:sz w:val="14"/>
-                <w:szCs w:val="14"/>
-              </w:rPr>
-              <w:t xml:space="preserve">Common-data ΛCDM / wCDM / CPL / DDM comparison</w:t>
-            </w:r>
-          </w:p>
-        </w:tc>
-        <w:tc>
-          <w:tcPr>
-            <w:tcW w:type="dxa" w:w="4150"/>
-            <w:tcBorders>
-              <w:top w:val="single" w:color="A8B3C2" w:sz="2"/>
-              <w:left w:val="single" w:color="A8B3C2" w:sz="2"/>
-              <w:bottom w:val="single" w:color="A8B3C2" w:sz="2"/>
-              <w:right w:val="single" w:color="A8B3C2" w:sz="2"/>
-            </w:tcBorders>
-            <w:shd w:fill="FFFFFF" w:val="clear"/>
-            <w:tcMar>
-              <w:top w:type="dxa" w:w="70"/>
-              <w:left w:type="dxa" w:w="90"/>
-              <w:bottom w:type="dxa" w:w="70"/>
-              <w:right w:type="dxa" w:w="90"/>
-            </w:tcMar>
-            <w:vAlign w:val="center"/>
-          </w:tcPr>
-          <w:p>
-            <w:pPr>
-              <w:spacing w:after="0" w:before="0"/>
-            </w:pPr>
-            <w:r>
-              <w:rPr>
-                <w:b w:val="false"/>
-                <w:bCs w:val="false"/>
-                <w:color w:val="202B36"/>
-                <w:sz w:val="14"/>
-                <w:szCs w:val="14"/>
-              </w:rPr>
-              <w:t xml:space="preserve">χ² = 15.578 / 14.971 / 7.120 / 9.717; CPL lowest AIC</w:t>
-            </w:r>
-          </w:p>
-        </w:tc>
-        <w:tc>
-          <w:tcPr>
-            <w:tcW w:type="dxa" w:w="2600"/>
-            <w:tcBorders>
-              <w:top w:val="single" w:color="A8B3C2" w:sz="2"/>
-              <w:left w:val="single" w:color="A8B3C2" w:sz="2"/>
-              <w:bottom w:val="single" w:color="A8B3C2" w:sz="2"/>
-              <w:right w:val="single" w:color="A8B3C2" w:sz="2"/>
-            </w:tcBorders>
-            <w:shd w:fill="FFFFFF" w:val="clear"/>
-            <w:tcMar>
-              <w:top w:type="dxa" w:w="70"/>
-              <w:left w:type="dxa" w:w="90"/>
-              <w:bottom w:type="dxa" w:w="70"/>
-              <w:right w:type="dxa" w:w="90"/>
-            </w:tcMar>
-            <w:vAlign w:val="center"/>
-          </w:tcPr>
-          <w:p>
-            <w:pPr>
-              <w:spacing w:after="0" w:before="0"/>
-            </w:pPr>
-            <w:r>
-              <w:rPr>
-                <w:b w:val="false"/>
-                <w:bCs w:val="false"/>
-                <w:color w:val="202B36"/>
-                <w:sz w:val="14"/>
-                <w:szCs w:val="14"/>
-              </w:rPr>
-              <w:t xml:space="preserve">DDM NOT SELECTED</w:t>
-            </w:r>
-          </w:p>
-        </w:tc>
-      </w:tr>
-      <w:tr>
-        <w:trPr>
-          <w:cantSplit/>
-          <w:tblHeader w:val="false"/>
-        </w:trPr>
-        <w:tc>
-          <w:tcPr>
-            <w:tcW w:type="dxa" w:w="480"/>
-            <w:tcBorders>
-              <w:top w:val="single" w:color="A8B3C2" w:sz="2"/>
-              <w:left w:val="single" w:color="A8B3C2" w:sz="2"/>
-              <w:bottom w:val="single" w:color="A8B3C2" w:sz="2"/>
-              <w:right w:val="single" w:color="A8B3C2" w:sz="2"/>
-            </w:tcBorders>
-            <w:shd w:fill="F2F4F7" w:val="clear"/>
-            <w:tcMar>
-              <w:top w:type="dxa" w:w="70"/>
-              <w:left w:type="dxa" w:w="90"/>
-              <w:bottom w:type="dxa" w:w="70"/>
-              <w:right w:type="dxa" w:w="90"/>
-            </w:tcMar>
-            <w:vAlign w:val="center"/>
-          </w:tcPr>
-          <w:p>
-            <w:pPr>
-              <w:spacing w:after="0" w:before="0"/>
-            </w:pPr>
-            <w:r>
-              <w:rPr>
-                <w:b w:val="false"/>
-                <w:bCs w:val="false"/>
-                <w:color w:val="202B36"/>
-                <w:sz w:val="14"/>
-                <w:szCs w:val="14"/>
-              </w:rPr>
-              <w:t xml:space="preserve">28</w:t>
-            </w:r>
-          </w:p>
-        </w:tc>
-        <w:tc>
-          <w:tcPr>
-            <w:tcW w:type="dxa" w:w="2450"/>
-            <w:tcBorders>
-              <w:top w:val="single" w:color="A8B3C2" w:sz="2"/>
-              <w:left w:val="single" w:color="A8B3C2" w:sz="2"/>
-              <w:bottom w:val="single" w:color="A8B3C2" w:sz="2"/>
-              <w:right w:val="single" w:color="A8B3C2" w:sz="2"/>
-            </w:tcBorders>
-            <w:shd w:fill="F2F4F7" w:val="clear"/>
-            <w:tcMar>
-              <w:top w:type="dxa" w:w="70"/>
-              <w:left w:type="dxa" w:w="90"/>
-              <w:bottom w:type="dxa" w:w="70"/>
-              <w:right w:type="dxa" w:w="90"/>
-            </w:tcMar>
-            <w:vAlign w:val="center"/>
-          </w:tcPr>
-          <w:p>
-            <w:pPr>
-              <w:spacing w:after="0" w:before="0"/>
-            </w:pPr>
-            <w:r>
-              <w:rPr>
-                <w:b w:val="false"/>
-                <w:bCs w:val="false"/>
-                <w:color w:val="202B36"/>
-                <w:sz w:val="14"/>
-                <w:szCs w:val="14"/>
-              </w:rPr>
-              <w:t xml:space="preserve">DDM prior sensitivity</w:t>
-            </w:r>
-          </w:p>
-        </w:tc>
-        <w:tc>
-          <w:tcPr>
-            <w:tcW w:type="dxa" w:w="4150"/>
-            <w:tcBorders>
-              <w:top w:val="single" w:color="A8B3C2" w:sz="2"/>
-              <w:left w:val="single" w:color="A8B3C2" w:sz="2"/>
-              <w:bottom w:val="single" w:color="A8B3C2" w:sz="2"/>
-              <w:right w:val="single" w:color="A8B3C2" w:sz="2"/>
-            </w:tcBorders>
-            <w:shd w:fill="F2F4F7" w:val="clear"/>
-            <w:tcMar>
-              <w:top w:type="dxa" w:w="70"/>
-              <w:left w:type="dxa" w:w="90"/>
-              <w:bottom w:type="dxa" w:w="70"/>
-              <w:right w:type="dxa" w:w="90"/>
-            </w:tcMar>
-            <w:vAlign w:val="center"/>
-          </w:tcPr>
-          <w:p>
-            <w:pPr>
-              <w:spacing w:after="0" w:before="0"/>
-            </w:pPr>
-            <w:r>
-              <w:rPr>
-                <w:b w:val="false"/>
-                <w:bCs w:val="false"/>
-                <w:color w:val="202B36"/>
-                <w:sz w:val="14"/>
-                <w:szCs w:val="14"/>
-              </w:rPr>
-              <w:t xml:space="preserve">best w₀ᵈᵐ follows −0.05/−0.10/−0.20 walls; T=5.681/5.861/6.024</w:t>
-            </w:r>
-          </w:p>
-        </w:tc>
-        <w:tc>
-          <w:tcPr>
-            <w:tcW w:type="dxa" w:w="2600"/>
-            <w:tcBorders>
-              <w:top w:val="single" w:color="A8B3C2" w:sz="2"/>
-              <w:left w:val="single" w:color="A8B3C2" w:sz="2"/>
-              <w:bottom w:val="single" w:color="A8B3C2" w:sz="2"/>
-              <w:right w:val="single" w:color="A8B3C2" w:sz="2"/>
-            </w:tcBorders>
-            <w:shd w:fill="F2F4F7" w:val="clear"/>
-            <w:tcMar>
-              <w:top w:type="dxa" w:w="70"/>
-              <w:left w:type="dxa" w:w="90"/>
-              <w:bottom w:type="dxa" w:w="70"/>
-              <w:right w:type="dxa" w:w="90"/>
-            </w:tcMar>
-            <w:vAlign w:val="center"/>
-          </w:tcPr>
-          <w:p>
-            <w:pPr>
-              <w:spacing w:after="0" w:before="0"/>
-            </w:pPr>
-            <w:r>
-              <w:rPr>
-                <w:b w:val="false"/>
-                <w:bCs w:val="false"/>
-                <w:color w:val="202B36"/>
-                <w:sz w:val="14"/>
-                <w:szCs w:val="14"/>
-              </w:rPr>
-              <w:t xml:space="preserve">PARAMETER CLAIM NOT PRIOR-STABLE</w:t>
-            </w:r>
-          </w:p>
-        </w:tc>
-      </w:tr>
-      <w:tr>
-        <w:trPr>
-          <w:cantSplit/>
-          <w:tblHeader w:val="false"/>
-        </w:trPr>
-        <w:tc>
-          <w:tcPr>
-            <w:tcW w:type="dxa" w:w="480"/>
-            <w:tcBorders>
-              <w:top w:val="single" w:color="A8B3C2" w:sz="2"/>
-              <w:left w:val="single" w:color="A8B3C2" w:sz="2"/>
-              <w:bottom w:val="single" w:color="A8B3C2" w:sz="2"/>
-              <w:right w:val="single" w:color="A8B3C2" w:sz="2"/>
-            </w:tcBorders>
-            <w:shd w:fill="FFFFFF" w:val="clear"/>
-            <w:tcMar>
-              <w:top w:type="dxa" w:w="70"/>
-              <w:left w:type="dxa" w:w="90"/>
-              <w:bottom w:type="dxa" w:w="70"/>
-              <w:right w:type="dxa" w:w="90"/>
-            </w:tcMar>
-            <w:vAlign w:val="center"/>
-          </w:tcPr>
-          <w:p>
-            <w:pPr>
-              <w:spacing w:after="0" w:before="0"/>
-            </w:pPr>
-            <w:r>
-              <w:rPr>
-                <w:b w:val="false"/>
-                <w:bCs w:val="false"/>
-                <w:color w:val="202B36"/>
-                <w:sz w:val="14"/>
-                <w:szCs w:val="14"/>
-              </w:rPr>
-              <w:t xml:space="preserve">29</w:t>
-            </w:r>
-          </w:p>
-        </w:tc>
-        <w:tc>
-          <w:tcPr>
-            <w:tcW w:type="dxa" w:w="2450"/>
-            <w:tcBorders>
-              <w:top w:val="single" w:color="A8B3C2" w:sz="2"/>
-              <w:left w:val="single" w:color="A8B3C2" w:sz="2"/>
-              <w:bottom w:val="single" w:color="A8B3C2" w:sz="2"/>
-              <w:right w:val="single" w:color="A8B3C2" w:sz="2"/>
-            </w:tcBorders>
-            <w:shd w:fill="FFFFFF" w:val="clear"/>
-            <w:tcMar>
-              <w:top w:type="dxa" w:w="70"/>
-              <w:left w:type="dxa" w:w="90"/>
-              <w:bottom w:type="dxa" w:w="70"/>
-              <w:right w:type="dxa" w:w="90"/>
-            </w:tcMar>
-            <w:vAlign w:val="center"/>
-          </w:tcPr>
-          <w:p>
-            <w:pPr>
-              <w:spacing w:after="0" w:before="0"/>
-            </w:pPr>
-            <w:r>
-              <w:rPr>
-                <w:b w:val="false"/>
-                <w:bCs w:val="false"/>
-                <w:color w:val="202B36"/>
-                <w:sz w:val="14"/>
-                <w:szCs w:val="14"/>
-              </w:rPr>
-              <w:t xml:space="preserve">DDM non-regular ΛCDM bootstrap, 5,000 mocks</w:t>
-            </w:r>
-          </w:p>
-        </w:tc>
-        <w:tc>
-          <w:tcPr>
-            <w:tcW w:type="dxa" w:w="4150"/>
-            <w:tcBorders>
-              <w:top w:val="single" w:color="A8B3C2" w:sz="2"/>
-              <w:left w:val="single" w:color="A8B3C2" w:sz="2"/>
-              <w:bottom w:val="single" w:color="A8B3C2" w:sz="2"/>
-              <w:right w:val="single" w:color="A8B3C2" w:sz="2"/>
-            </w:tcBorders>
-            <w:shd w:fill="FFFFFF" w:val="clear"/>
-            <w:tcMar>
-              <w:top w:type="dxa" w:w="70"/>
-              <w:left w:type="dxa" w:w="90"/>
-              <w:bottom w:type="dxa" w:w="70"/>
-              <w:right w:type="dxa" w:w="90"/>
-            </w:tcMar>
-            <w:vAlign w:val="center"/>
-          </w:tcPr>
-          <w:p>
-            <w:pPr>
-              <w:spacing w:after="0" w:before="0"/>
-            </w:pPr>
-            <w:r>
-              <w:rPr>
-                <w:b w:val="false"/>
-                <w:bCs w:val="false"/>
-                <w:color w:val="202B36"/>
-                <w:sz w:val="14"/>
-                <w:szCs w:val="14"/>
-              </w:rPr>
-              <w:t xml:space="preserve">T=5.861; 354/5,000; p=0.0708 [0.0638–0.0783]</w:t>
-            </w:r>
-          </w:p>
-        </w:tc>
-        <w:tc>
-          <w:tcPr>
-            <w:tcW w:type="dxa" w:w="2600"/>
-            <w:tcBorders>
-              <w:top w:val="single" w:color="A8B3C2" w:sz="2"/>
-              <w:left w:val="single" w:color="A8B3C2" w:sz="2"/>
-              <w:bottom w:val="single" w:color="A8B3C2" w:sz="2"/>
-              <w:right w:val="single" w:color="A8B3C2" w:sz="2"/>
-            </w:tcBorders>
-            <w:shd w:fill="FFFFFF" w:val="clear"/>
-            <w:tcMar>
-              <w:top w:type="dxa" w:w="70"/>
-              <w:left w:type="dxa" w:w="90"/>
-              <w:bottom w:type="dxa" w:w="70"/>
-              <w:right w:type="dxa" w:w="90"/>
-            </w:tcMar>
-            <w:vAlign w:val="center"/>
-          </w:tcPr>
-          <w:p>
-            <w:pPr>
-              <w:spacing w:after="0" w:before="0"/>
-            </w:pPr>
-            <w:r>
-              <w:rPr>
-                <w:b w:val="false"/>
-                <w:bCs w:val="false"/>
-                <w:color w:val="202B36"/>
-                <w:sz w:val="14"/>
-                <w:szCs w:val="14"/>
-              </w:rPr>
-              <w:t xml:space="preserve">FAILS MODEL-SIGNIFICANCE GATE</w:t>
-            </w:r>
-          </w:p>
-        </w:tc>
-      </w:tr>
-      <w:tr>
-        <w:trPr>
-          <w:cantSplit/>
-          <w:tblHeader w:val="false"/>
-        </w:trPr>
-        <w:tc>
-          <w:tcPr>
-            <w:tcW w:type="dxa" w:w="480"/>
-            <w:tcBorders>
-              <w:top w:val="single" w:color="A8B3C2" w:sz="2"/>
-              <w:left w:val="single" w:color="A8B3C2" w:sz="2"/>
-              <w:bottom w:val="single" w:color="A8B3C2" w:sz="2"/>
-              <w:right w:val="single" w:color="A8B3C2" w:sz="2"/>
-            </w:tcBorders>
-            <w:shd w:fill="F2F4F7" w:val="clear"/>
-            <w:tcMar>
-              <w:top w:type="dxa" w:w="70"/>
-              <w:left w:type="dxa" w:w="90"/>
-              <w:bottom w:type="dxa" w:w="70"/>
-              <w:right w:type="dxa" w:w="90"/>
-            </w:tcMar>
-            <w:vAlign w:val="center"/>
-          </w:tcPr>
-          <w:p>
-            <w:pPr>
-              <w:spacing w:after="0" w:before="0"/>
-            </w:pPr>
-            <w:r>
-              <w:rPr>
-                <w:b w:val="false"/>
-                <w:bCs w:val="false"/>
-                <w:color w:val="202B36"/>
-                <w:sz w:val="14"/>
-                <w:szCs w:val="14"/>
-              </w:rPr>
-              <w:t xml:space="preserve">30</w:t>
-            </w:r>
-          </w:p>
-        </w:tc>
-        <w:tc>
-          <w:tcPr>
-            <w:tcW w:type="dxa" w:w="2450"/>
-            <w:tcBorders>
-              <w:top w:val="single" w:color="A8B3C2" w:sz="2"/>
-              <w:left w:val="single" w:color="A8B3C2" w:sz="2"/>
-              <w:bottom w:val="single" w:color="A8B3C2" w:sz="2"/>
-              <w:right w:val="single" w:color="A8B3C2" w:sz="2"/>
-            </w:tcBorders>
-            <w:shd w:fill="F2F4F7" w:val="clear"/>
-            <w:tcMar>
-              <w:top w:type="dxa" w:w="70"/>
-              <w:left w:type="dxa" w:w="90"/>
-              <w:bottom w:type="dxa" w:w="70"/>
-              <w:right w:type="dxa" w:w="90"/>
-            </w:tcMar>
-            <w:vAlign w:val="center"/>
-          </w:tcPr>
-          <w:p>
-            <w:pPr>
-              <w:spacing w:after="0" w:before="0"/>
-            </w:pPr>
-            <w:r>
-              <w:rPr>
-                <w:b w:val="false"/>
-                <w:bCs w:val="false"/>
-                <w:color w:val="202B36"/>
-                <w:sz w:val="14"/>
-                <w:szCs w:val="14"/>
-              </w:rPr>
-              <w:t xml:space="preserve">DDM deletion and selection calibration</w:t>
-            </w:r>
-          </w:p>
-        </w:tc>
-        <w:tc>
-          <w:tcPr>
-            <w:tcW w:type="dxa" w:w="4150"/>
-            <w:tcBorders>
-              <w:top w:val="single" w:color="A8B3C2" w:sz="2"/>
-              <w:left w:val="single" w:color="A8B3C2" w:sz="2"/>
-              <w:bottom w:val="single" w:color="A8B3C2" w:sz="2"/>
-              <w:right w:val="single" w:color="A8B3C2" w:sz="2"/>
-            </w:tcBorders>
-            <w:shd w:fill="F2F4F7" w:val="clear"/>
-            <w:tcMar>
-              <w:top w:type="dxa" w:w="70"/>
-              <w:left w:type="dxa" w:w="90"/>
-              <w:bottom w:type="dxa" w:w="70"/>
-              <w:right w:type="dxa" w:w="90"/>
-            </w:tcMar>
-            <w:vAlign w:val="center"/>
-          </w:tcPr>
-          <w:p>
-            <w:pPr>
-              <w:spacing w:after="0" w:before="0"/>
-            </w:pPr>
-            <w:r>
-              <w:rPr>
-                <w:b w:val="false"/>
-                <w:bCs w:val="false"/>
-                <w:color w:val="202B36"/>
-                <w:sz w:val="14"/>
-                <w:szCs w:val="14"/>
-              </w:rPr>
-              <w:t xml:space="preserve">LRG2: T 5.861→3.461; no-LRG2 p=0.2278; conditional selected influence 216/354, p=0.610 [0.557–0.661]</w:t>
-            </w:r>
-          </w:p>
-        </w:tc>
-        <w:tc>
-          <w:tcPr>
-            <w:tcW w:type="dxa" w:w="2600"/>
-            <w:tcBorders>
-              <w:top w:val="single" w:color="A8B3C2" w:sz="2"/>
-              <w:left w:val="single" w:color="A8B3C2" w:sz="2"/>
-              <w:bottom w:val="single" w:color="A8B3C2" w:sz="2"/>
-              <w:right w:val="single" w:color="A8B3C2" w:sz="2"/>
-            </w:tcBorders>
-            <w:shd w:fill="F2F4F7" w:val="clear"/>
-            <w:tcMar>
-              <w:top w:type="dxa" w:w="70"/>
-              <w:left w:type="dxa" w:w="90"/>
-              <w:bottom w:type="dxa" w:w="70"/>
-              <w:right w:type="dxa" w:w="90"/>
-            </w:tcMar>
-            <w:vAlign w:val="center"/>
-          </w:tcPr>
-          <w:p>
-            <w:pPr>
-              <w:spacing w:after="0" w:before="0"/>
-            </w:pPr>
-            <w:r>
-              <w:rPr>
-                <w:b w:val="false"/>
-                <w:bCs w:val="false"/>
-                <w:color w:val="202B36"/>
-                <w:sz w:val="14"/>
-                <w:szCs w:val="14"/>
-              </w:rPr>
-              <w:t xml:space="preserve">LRG2-SENSITIVE, BUT LOCALIZATION ORDINARY</w:t>
-            </w:r>
-          </w:p>
-        </w:tc>
-      </w:tr>
-      <w:tr>
-        <w:trPr>
-          <w:cantSplit/>
-          <w:tblHeader w:val="false"/>
-        </w:trPr>
-        <w:tc>
-          <w:tcPr>
-            <w:tcW w:type="dxa" w:w="480"/>
-            <w:tcBorders>
-              <w:top w:val="single" w:color="A8B3C2" w:sz="2"/>
-              <w:left w:val="single" w:color="A8B3C2" w:sz="2"/>
-              <w:bottom w:val="single" w:color="A8B3C2" w:sz="2"/>
-              <w:right w:val="single" w:color="A8B3C2" w:sz="2"/>
-            </w:tcBorders>
-            <w:shd w:fill="FFFFFF" w:val="clear"/>
-            <w:tcMar>
-              <w:top w:type="dxa" w:w="70"/>
-              <w:left w:type="dxa" w:w="90"/>
-              <w:bottom w:type="dxa" w:w="70"/>
-              <w:right w:type="dxa" w:w="90"/>
-            </w:tcMar>
-            <w:vAlign w:val="center"/>
-          </w:tcPr>
-          <w:p>
-            <w:pPr>
-              <w:spacing w:after="0" w:before="0"/>
-            </w:pPr>
-            <w:r>
-              <w:rPr>
-                <w:b w:val="false"/>
-                <w:bCs w:val="false"/>
-                <w:color w:val="202B36"/>
-                <w:sz w:val="14"/>
-                <w:szCs w:val="14"/>
-              </w:rPr>
-              <w:t xml:space="preserve">31</w:t>
-            </w:r>
-          </w:p>
-        </w:tc>
-        <w:tc>
-          <w:tcPr>
-            <w:tcW w:type="dxa" w:w="2450"/>
-            <w:tcBorders>
-              <w:top w:val="single" w:color="A8B3C2" w:sz="2"/>
-              <w:left w:val="single" w:color="A8B3C2" w:sz="2"/>
-              <w:bottom w:val="single" w:color="A8B3C2" w:sz="2"/>
-              <w:right w:val="single" w:color="A8B3C2" w:sz="2"/>
-            </w:tcBorders>
-            <w:shd w:fill="FFFFFF" w:val="clear"/>
-            <w:tcMar>
-              <w:top w:type="dxa" w:w="70"/>
-              <w:left w:type="dxa" w:w="90"/>
-              <w:bottom w:type="dxa" w:w="70"/>
-              <w:right w:type="dxa" w:w="90"/>
-            </w:tcMar>
-            <w:vAlign w:val="center"/>
-          </w:tcPr>
-          <w:p>
-            <w:pPr>
-              <w:spacing w:after="0" w:before="0"/>
-            </w:pPr>
-            <w:r>
-              <w:rPr>
-                <w:b w:val="false"/>
-                <w:bCs w:val="false"/>
-                <w:color w:val="202B36"/>
-                <w:sz w:val="14"/>
-                <w:szCs w:val="14"/>
-              </w:rPr>
-              <w:t xml:space="preserve">DDM DES5Y matched non-regular null</w:t>
-            </w:r>
-          </w:p>
-        </w:tc>
-        <w:tc>
-          <w:tcPr>
-            <w:tcW w:type="dxa" w:w="4150"/>
-            <w:tcBorders>
-              <w:top w:val="single" w:color="A8B3C2" w:sz="2"/>
-              <w:left w:val="single" w:color="A8B3C2" w:sz="2"/>
-              <w:bottom w:val="single" w:color="A8B3C2" w:sz="2"/>
-              <w:right w:val="single" w:color="A8B3C2" w:sz="2"/>
-            </w:tcBorders>
-            <w:shd w:fill="FFFFFF" w:val="clear"/>
-            <w:tcMar>
-              <w:top w:type="dxa" w:w="70"/>
-              <w:left w:type="dxa" w:w="90"/>
-              <w:bottom w:type="dxa" w:w="70"/>
-              <w:right w:type="dxa" w:w="90"/>
-            </w:tcMar>
-            <w:vAlign w:val="center"/>
-          </w:tcPr>
-          <w:p>
-            <w:pPr>
-              <w:spacing w:after="0" w:before="0"/>
-            </w:pPr>
-            <w:r>
-              <w:rPr>
-                <w:b w:val="false"/>
-                <w:bCs w:val="false"/>
-                <w:color w:val="202B36"/>
-                <w:sz w:val="14"/>
-                <w:szCs w:val="14"/>
-              </w:rPr>
-              <w:t xml:space="preserve">baseline T=9.603; 61/5,000; p=0.0122 [0.00934–0.01564]</w:t>
-            </w:r>
-          </w:p>
-        </w:tc>
-        <w:tc>
-          <w:tcPr>
-            <w:tcW w:type="dxa" w:w="2600"/>
-            <w:tcBorders>
-              <w:top w:val="single" w:color="A8B3C2" w:sz="2"/>
-              <w:left w:val="single" w:color="A8B3C2" w:sz="2"/>
-              <w:bottom w:val="single" w:color="A8B3C2" w:sz="2"/>
-              <w:right w:val="single" w:color="A8B3C2" w:sz="2"/>
-            </w:tcBorders>
-            <w:shd w:fill="FFFFFF" w:val="clear"/>
-            <w:tcMar>
-              <w:top w:type="dxa" w:w="70"/>
-              <w:left w:type="dxa" w:w="90"/>
-              <w:bottom w:type="dxa" w:w="70"/>
-              <w:right w:type="dxa" w:w="90"/>
-            </w:tcMar>
-            <w:vAlign w:val="center"/>
-          </w:tcPr>
-          <w:p>
-            <w:pPr>
-              <w:spacing w:after="0" w:before="0"/>
-            </w:pPr>
-            <w:r>
-              <w:rPr>
-                <w:b w:val="false"/>
-                <w:bCs w:val="false"/>
-                <w:color w:val="202B36"/>
-                <w:sz w:val="14"/>
-                <w:szCs w:val="14"/>
-              </w:rPr>
-              <w:t xml:space="preserve">INTERESTING COMBINED-DATA HINT</w:t>
-            </w:r>
-          </w:p>
-        </w:tc>
-      </w:tr>
-      <w:tr>
-        <w:trPr>
-          <w:cantSplit/>
-          <w:tblHeader w:val="false"/>
-        </w:trPr>
-        <w:tc>
-          <w:tcPr>
-            <w:tcW w:type="dxa" w:w="480"/>
-            <w:tcBorders>
-              <w:top w:val="single" w:color="A8B3C2" w:sz="2"/>
-              <w:left w:val="single" w:color="A8B3C2" w:sz="2"/>
-              <w:bottom w:val="single" w:color="A8B3C2" w:sz="2"/>
-              <w:right w:val="single" w:color="A8B3C2" w:sz="2"/>
-            </w:tcBorders>
-            <w:shd w:fill="F2F4F7" w:val="clear"/>
-            <w:tcMar>
-              <w:top w:type="dxa" w:w="70"/>
-              <w:left w:type="dxa" w:w="90"/>
-              <w:bottom w:type="dxa" w:w="70"/>
-              <w:right w:type="dxa" w:w="90"/>
-            </w:tcMar>
-            <w:vAlign w:val="center"/>
-          </w:tcPr>
-          <w:p>
-            <w:pPr>
-              <w:spacing w:after="0" w:before="0"/>
-            </w:pPr>
-            <w:r>
-              <w:rPr>
-                <w:b w:val="false"/>
-                <w:bCs w:val="false"/>
-                <w:color w:val="202B36"/>
-                <w:sz w:val="14"/>
-                <w:szCs w:val="14"/>
-              </w:rPr>
-              <w:t xml:space="preserve">32</w:t>
-            </w:r>
-          </w:p>
-        </w:tc>
-        <w:tc>
-          <w:tcPr>
-            <w:tcW w:type="dxa" w:w="2450"/>
-            <w:tcBorders>
-              <w:top w:val="single" w:color="A8B3C2" w:sz="2"/>
-              <w:left w:val="single" w:color="A8B3C2" w:sz="2"/>
-              <w:bottom w:val="single" w:color="A8B3C2" w:sz="2"/>
-              <w:right w:val="single" w:color="A8B3C2" w:sz="2"/>
-            </w:tcBorders>
-            <w:shd w:fill="F2F4F7" w:val="clear"/>
-            <w:tcMar>
-              <w:top w:type="dxa" w:w="70"/>
-              <w:left w:type="dxa" w:w="90"/>
-              <w:bottom w:type="dxa" w:w="70"/>
-              <w:right w:type="dxa" w:w="90"/>
-            </w:tcMar>
-            <w:vAlign w:val="center"/>
-          </w:tcPr>
-          <w:p>
-            <w:pPr>
-              <w:spacing w:after="0" w:before="0"/>
-            </w:pPr>
-            <w:r>
-              <w:rPr>
-                <w:b w:val="false"/>
-                <w:bCs w:val="false"/>
-                <w:color w:val="202B36"/>
-                <w:sz w:val="14"/>
-                <w:szCs w:val="14"/>
-              </w:rPr>
-              <w:t xml:space="preserve">DDM low-z offset with separately fitted null</w:t>
-            </w:r>
-          </w:p>
-        </w:tc>
-        <w:tc>
-          <w:tcPr>
-            <w:tcW w:type="dxa" w:w="4150"/>
-            <w:tcBorders>
-              <w:top w:val="single" w:color="A8B3C2" w:sz="2"/>
-              <w:left w:val="single" w:color="A8B3C2" w:sz="2"/>
-              <w:bottom w:val="single" w:color="A8B3C2" w:sz="2"/>
-              <w:right w:val="single" w:color="A8B3C2" w:sz="2"/>
-            </w:tcBorders>
-            <w:shd w:fill="F2F4F7" w:val="clear"/>
-            <w:tcMar>
-              <w:top w:type="dxa" w:w="70"/>
-              <w:left w:type="dxa" w:w="90"/>
-              <w:bottom w:type="dxa" w:w="70"/>
-              <w:right w:type="dxa" w:w="90"/>
-            </w:tcMar>
-            <w:vAlign w:val="center"/>
-          </w:tcPr>
-          <w:p>
-            <w:pPr>
-              <w:spacing w:after="0" w:before="0"/>
-            </w:pPr>
-            <w:r>
-              <w:rPr>
-                <w:b w:val="false"/>
-                <w:bCs w:val="false"/>
-                <w:color w:val="202B36"/>
-                <w:sz w:val="14"/>
-                <w:szCs w:val="14"/>
-              </w:rPr>
-              <w:t xml:space="preserve">+0.0315 mag; T=5.358; 467/5,000; p=0.0934 [0.0855–0.1018]</w:t>
-            </w:r>
-          </w:p>
-        </w:tc>
-        <w:tc>
-          <w:tcPr>
-            <w:tcW w:type="dxa" w:w="2600"/>
-            <w:tcBorders>
-              <w:top w:val="single" w:color="A8B3C2" w:sz="2"/>
-              <w:left w:val="single" w:color="A8B3C2" w:sz="2"/>
-              <w:bottom w:val="single" w:color="A8B3C2" w:sz="2"/>
-              <w:right w:val="single" w:color="A8B3C2" w:sz="2"/>
-            </w:tcBorders>
-            <w:shd w:fill="F2F4F7" w:val="clear"/>
-            <w:tcMar>
-              <w:top w:type="dxa" w:w="70"/>
-              <w:left w:type="dxa" w:w="90"/>
-              <w:bottom w:type="dxa" w:w="70"/>
-              <w:right w:type="dxa" w:w="90"/>
-            </w:tcMar>
-            <w:vAlign w:val="center"/>
-          </w:tcPr>
-          <w:p>
-            <w:pPr>
-              <w:spacing w:after="0" w:before="0"/>
-            </w:pPr>
-            <w:r>
-              <w:rPr>
-                <w:b w:val="false"/>
-                <w:bCs w:val="false"/>
-                <w:color w:val="202B36"/>
-                <w:sz w:val="14"/>
-                <w:szCs w:val="14"/>
-              </w:rPr>
-              <w:t xml:space="preserve">MODEL SIGNIFICANCE CALIBRATION-DEPENDENT</w:t>
-            </w:r>
-          </w:p>
-        </w:tc>
-      </w:tr>
-      <w:tr>
-        <w:trPr>
-          <w:cantSplit/>
-          <w:tblHeader w:val="false"/>
-        </w:trPr>
-        <w:tc>
-          <w:tcPr>
-            <w:tcW w:type="dxa" w:w="480"/>
-            <w:tcBorders>
-              <w:top w:val="single" w:color="A8B3C2" w:sz="2"/>
-              <w:left w:val="single" w:color="A8B3C2" w:sz="2"/>
-              <w:bottom w:val="single" w:color="A8B3C2" w:sz="2"/>
-              <w:right w:val="single" w:color="A8B3C2" w:sz="2"/>
-            </w:tcBorders>
-            <w:shd w:fill="FFFFFF" w:val="clear"/>
-            <w:tcMar>
-              <w:top w:type="dxa" w:w="70"/>
-              <w:left w:type="dxa" w:w="90"/>
-              <w:bottom w:type="dxa" w:w="70"/>
-              <w:right w:type="dxa" w:w="90"/>
-            </w:tcMar>
-            <w:vAlign w:val="center"/>
-          </w:tcPr>
-          <w:p>
-            <w:pPr>
-              <w:spacing w:after="0" w:before="0"/>
-            </w:pPr>
-            <w:r>
-              <w:rPr>
-                <w:b w:val="false"/>
-                <w:bCs w:val="false"/>
-                <w:color w:val="202B36"/>
-                <w:sz w:val="14"/>
-                <w:szCs w:val="14"/>
-              </w:rPr>
-              <w:t xml:space="preserve">33</w:t>
-            </w:r>
-          </w:p>
-        </w:tc>
-        <w:tc>
-          <w:tcPr>
-            <w:tcW w:type="dxa" w:w="2450"/>
-            <w:tcBorders>
-              <w:top w:val="single" w:color="A8B3C2" w:sz="2"/>
-              <w:left w:val="single" w:color="A8B3C2" w:sz="2"/>
-              <w:bottom w:val="single" w:color="A8B3C2" w:sz="2"/>
-              <w:right w:val="single" w:color="A8B3C2" w:sz="2"/>
-            </w:tcBorders>
-            <w:shd w:fill="FFFFFF" w:val="clear"/>
-            <w:tcMar>
-              <w:top w:type="dxa" w:w="70"/>
-              <w:left w:type="dxa" w:w="90"/>
-              <w:bottom w:type="dxa" w:w="70"/>
-              <w:right w:type="dxa" w:w="90"/>
-            </w:tcMar>
-            <w:vAlign w:val="center"/>
-          </w:tcPr>
-          <w:p>
-            <w:pPr>
-              <w:spacing w:after="0" w:before="0"/>
-            </w:pPr>
-            <w:r>
-              <w:rPr>
-                <w:b w:val="false"/>
-                <w:bCs w:val="false"/>
-                <w:color w:val="202B36"/>
-                <w:sz w:val="14"/>
-                <w:szCs w:val="14"/>
-              </w:rPr>
-              <w:t xml:space="preserve">Independent CLASS perturbation controls</w:t>
-            </w:r>
-          </w:p>
-        </w:tc>
-        <w:tc>
-          <w:tcPr>
-            <w:tcW w:type="dxa" w:w="4150"/>
-            <w:tcBorders>
-              <w:top w:val="single" w:color="A8B3C2" w:sz="2"/>
-              <w:left w:val="single" w:color="A8B3C2" w:sz="2"/>
-              <w:bottom w:val="single" w:color="A8B3C2" w:sz="2"/>
-              <w:right w:val="single" w:color="A8B3C2" w:sz="2"/>
-            </w:tcBorders>
-            <w:shd w:fill="FFFFFF" w:val="clear"/>
-            <w:tcMar>
-              <w:top w:type="dxa" w:w="70"/>
-              <w:left w:type="dxa" w:w="90"/>
-              <w:bottom w:type="dxa" w:w="70"/>
-              <w:right w:type="dxa" w:w="90"/>
-            </w:tcMar>
-            <w:vAlign w:val="center"/>
-          </w:tcPr>
-          <w:p>
-            <w:pPr>
-              <w:spacing w:after="0" w:before="0"/>
-            </w:pPr>
-            <w:r>
-              <w:rPr>
-                <w:b w:val="false"/>
-                <w:bCs w:val="false"/>
-                <w:color w:val="202B36"/>
-                <w:sz w:val="14"/>
-                <w:szCs w:val="14"/>
-              </w:rPr>
-              <w:t xml:space="preserve">exact-CDM and tighter-integration P(k), σ₈, and lensing differences below thresholds</w:t>
-            </w:r>
-          </w:p>
-        </w:tc>
-        <w:tc>
-          <w:tcPr>
-            <w:tcW w:type="dxa" w:w="2600"/>
-            <w:tcBorders>
-              <w:top w:val="single" w:color="A8B3C2" w:sz="2"/>
-              <w:left w:val="single" w:color="A8B3C2" w:sz="2"/>
-              <w:bottom w:val="single" w:color="A8B3C2" w:sz="2"/>
-              <w:right w:val="single" w:color="A8B3C2" w:sz="2"/>
-            </w:tcBorders>
-            <w:shd w:fill="FFFFFF" w:val="clear"/>
-            <w:tcMar>
-              <w:top w:type="dxa" w:w="70"/>
-              <w:left w:type="dxa" w:w="90"/>
-              <w:bottom w:type="dxa" w:w="70"/>
-              <w:right w:type="dxa" w:w="90"/>
-            </w:tcMar>
-            <w:vAlign w:val="center"/>
-          </w:tcPr>
-          <w:p>
-            <w:pPr>
-              <w:spacing w:after="0" w:before="0"/>
-            </w:pPr>
-            <w:r>
-              <w:rPr>
-                <w:b w:val="false"/>
-                <w:bCs w:val="false"/>
-                <w:color w:val="202B36"/>
-                <w:sz w:val="14"/>
-                <w:szCs w:val="14"/>
-              </w:rPr>
-              <w:t xml:space="preserve">PASS AT LINEAR EQUATION LEVEL</w:t>
-            </w:r>
-          </w:p>
-        </w:tc>
-      </w:tr>
-      <w:tr>
-        <w:trPr>
-          <w:cantSplit/>
-          <w:tblHeader w:val="false"/>
-        </w:trPr>
-        <w:tc>
-          <w:tcPr>
-            <w:tcW w:type="dxa" w:w="480"/>
-            <w:tcBorders>
-              <w:top w:val="single" w:color="A8B3C2" w:sz="2"/>
-              <w:left w:val="single" w:color="A8B3C2" w:sz="2"/>
-              <w:bottom w:val="single" w:color="A8B3C2" w:sz="2"/>
-              <w:right w:val="single" w:color="A8B3C2" w:sz="2"/>
-            </w:tcBorders>
-            <w:shd w:fill="F2F4F7" w:val="clear"/>
-            <w:tcMar>
-              <w:top w:type="dxa" w:w="70"/>
-              <w:left w:type="dxa" w:w="90"/>
-              <w:bottom w:type="dxa" w:w="70"/>
-              <w:right w:type="dxa" w:w="90"/>
-            </w:tcMar>
-            <w:vAlign w:val="center"/>
-          </w:tcPr>
-          <w:p>
-            <w:pPr>
-              <w:spacing w:after="0" w:before="0"/>
-            </w:pPr>
-            <w:r>
-              <w:rPr>
-                <w:b w:val="false"/>
-                <w:bCs w:val="false"/>
-                <w:color w:val="202B36"/>
-                <w:sz w:val="14"/>
-                <w:szCs w:val="14"/>
-              </w:rPr>
-              <w:t xml:space="preserve">34</w:t>
-            </w:r>
-          </w:p>
-        </w:tc>
-        <w:tc>
-          <w:tcPr>
-            <w:tcW w:type="dxa" w:w="2450"/>
-            <w:tcBorders>
-              <w:top w:val="single" w:color="A8B3C2" w:sz="2"/>
-              <w:left w:val="single" w:color="A8B3C2" w:sz="2"/>
-              <w:bottom w:val="single" w:color="A8B3C2" w:sz="2"/>
-              <w:right w:val="single" w:color="A8B3C2" w:sz="2"/>
-            </w:tcBorders>
-            <w:shd w:fill="F2F4F7" w:val="clear"/>
-            <w:tcMar>
-              <w:top w:type="dxa" w:w="70"/>
-              <w:left w:type="dxa" w:w="90"/>
-              <w:bottom w:type="dxa" w:w="70"/>
-              <w:right w:type="dxa" w:w="90"/>
-            </w:tcMar>
-            <w:vAlign w:val="center"/>
-          </w:tcPr>
-          <w:p>
-            <w:pPr>
-              <w:spacing w:after="0" w:before="0"/>
-            </w:pPr>
-            <w:r>
-              <w:rPr>
-                <w:b w:val="false"/>
-                <w:bCs w:val="false"/>
-                <w:color w:val="202B36"/>
-                <w:sz w:val="14"/>
-                <w:szCs w:val="14"/>
-              </w:rPr>
-              <w:t xml:space="preserve">DDM compressed SDSS full-shape/growth prediction</w:t>
-            </w:r>
-          </w:p>
-        </w:tc>
-        <w:tc>
-          <w:tcPr>
-            <w:tcW w:type="dxa" w:w="4150"/>
-            <w:tcBorders>
-              <w:top w:val="single" w:color="A8B3C2" w:sz="2"/>
-              <w:left w:val="single" w:color="A8B3C2" w:sz="2"/>
-              <w:bottom w:val="single" w:color="A8B3C2" w:sz="2"/>
-              <w:right w:val="single" w:color="A8B3C2" w:sz="2"/>
-            </w:tcBorders>
-            <w:shd w:fill="F2F4F7" w:val="clear"/>
-            <w:tcMar>
-              <w:top w:type="dxa" w:w="70"/>
-              <w:left w:type="dxa" w:w="90"/>
-              <w:bottom w:type="dxa" w:w="70"/>
-              <w:right w:type="dxa" w:w="90"/>
-            </w:tcMar>
-            <w:vAlign w:val="center"/>
-          </w:tcPr>
-          <w:p>
-            <w:pPr>
-              <w:spacing w:after="0" w:before="0"/>
-            </w:pPr>
-            <w:r>
-              <w:rPr>
-                <w:b w:val="false"/>
-                <w:bCs w:val="false"/>
-                <w:color w:val="202B36"/>
-                <w:sz w:val="14"/>
-                <w:szCs w:val="14"/>
-              </w:rPr>
-              <w:t xml:space="preserve">source vectors: full p=0.0128/0.00181; growth p=0.00302/0.000368; amplitude rescue requires σ₈=0.918/0.931</w:t>
-            </w:r>
-          </w:p>
-        </w:tc>
-        <w:tc>
-          <w:tcPr>
-            <w:tcW w:type="dxa" w:w="2600"/>
-            <w:tcBorders>
-              <w:top w:val="single" w:color="A8B3C2" w:sz="2"/>
-              <w:left w:val="single" w:color="A8B3C2" w:sz="2"/>
-              <w:bottom w:val="single" w:color="A8B3C2" w:sz="2"/>
-              <w:right w:val="single" w:color="A8B3C2" w:sz="2"/>
-            </w:tcBorders>
-            <w:shd w:fill="F2F4F7" w:val="clear"/>
-            <w:tcMar>
-              <w:top w:type="dxa" w:w="70"/>
-              <w:left w:type="dxa" w:w="90"/>
-              <w:bottom w:type="dxa" w:w="70"/>
-              <w:right w:type="dxa" w:w="90"/>
-            </w:tcMar>
-            <w:vAlign w:val="center"/>
-          </w:tcPr>
-          <w:p>
-            <w:pPr>
-              <w:spacing w:after="0" w:before="0"/>
-            </w:pPr>
-            <w:r>
-              <w:rPr>
-                <w:b w:val="false"/>
-                <w:bCs w:val="false"/>
-                <w:color w:val="202B36"/>
-                <w:sz w:val="14"/>
-                <w:szCs w:val="14"/>
-              </w:rPr>
-              <w:t xml:space="preserve">SUBSTANTIAL FALSIFICATION PRESSURE; NATIVE REFIT OPEN</w:t>
-            </w:r>
-          </w:p>
-        </w:tc>
-      </w:tr>
-      <w:tr>
-        <w:trPr>
-          <w:cantSplit/>
-          <w:tblHeader w:val="false"/>
-        </w:trPr>
-        <w:tc>
-          <w:tcPr>
-            <w:tcW w:type="dxa" w:w="480"/>
-            <w:tcBorders>
-              <w:top w:val="single" w:color="A8B3C2" w:sz="2"/>
-              <w:left w:val="single" w:color="A8B3C2" w:sz="2"/>
-              <w:bottom w:val="single" w:color="A8B3C2" w:sz="2"/>
-              <w:right w:val="single" w:color="A8B3C2" w:sz="2"/>
-            </w:tcBorders>
-            <w:shd w:fill="FFFFFF" w:val="clear"/>
-            <w:tcMar>
-              <w:top w:type="dxa" w:w="70"/>
-              <w:left w:type="dxa" w:w="90"/>
-              <w:bottom w:type="dxa" w:w="70"/>
-              <w:right w:type="dxa" w:w="90"/>
-            </w:tcMar>
-            <w:vAlign w:val="center"/>
-          </w:tcPr>
-          <w:p>
-            <w:pPr>
-              <w:spacing w:after="0" w:before="0"/>
-            </w:pPr>
-            <w:r>
-              <w:rPr>
-                <w:b w:val="false"/>
-                <w:bCs w:val="false"/>
-                <w:color w:val="202B36"/>
-                <w:sz w:val="14"/>
-                <w:szCs w:val="14"/>
-              </w:rPr>
-              <w:t xml:space="preserve">35</w:t>
-            </w:r>
-          </w:p>
-        </w:tc>
-        <w:tc>
-          <w:tcPr>
-            <w:tcW w:type="dxa" w:w="2450"/>
-            <w:tcBorders>
-              <w:top w:val="single" w:color="A8B3C2" w:sz="2"/>
-              <w:left w:val="single" w:color="A8B3C2" w:sz="2"/>
-              <w:bottom w:val="single" w:color="A8B3C2" w:sz="2"/>
-              <w:right w:val="single" w:color="A8B3C2" w:sz="2"/>
-            </w:tcBorders>
-            <w:shd w:fill="FFFFFF" w:val="clear"/>
-            <w:tcMar>
-              <w:top w:type="dxa" w:w="70"/>
-              <w:left w:type="dxa" w:w="90"/>
-              <w:bottom w:type="dxa" w:w="70"/>
-              <w:right w:type="dxa" w:w="90"/>
-            </w:tcMar>
-            <w:vAlign w:val="center"/>
-          </w:tcPr>
-          <w:p>
-            <w:pPr>
-              <w:spacing w:after="0" w:before="0"/>
-            </w:pPr>
-            <w:r>
-              <w:rPr>
-                <w:b w:val="false"/>
-                <w:bCs w:val="false"/>
-                <w:color w:val="202B36"/>
-                <w:sz w:val="14"/>
-                <w:szCs w:val="14"/>
-              </w:rPr>
-              <w:t xml:space="preserve">DDM CMB-lensing prediction</w:t>
-            </w:r>
-          </w:p>
-        </w:tc>
-        <w:tc>
-          <w:tcPr>
-            <w:tcW w:type="dxa" w:w="4150"/>
-            <w:tcBorders>
-              <w:top w:val="single" w:color="A8B3C2" w:sz="2"/>
-              <w:left w:val="single" w:color="A8B3C2" w:sz="2"/>
-              <w:bottom w:val="single" w:color="A8B3C2" w:sz="2"/>
-              <w:right w:val="single" w:color="A8B3C2" w:sz="2"/>
-            </w:tcBorders>
-            <w:shd w:fill="FFFFFF" w:val="clear"/>
-            <w:tcMar>
-              <w:top w:type="dxa" w:w="70"/>
-              <w:left w:type="dxa" w:w="90"/>
-              <w:bottom w:type="dxa" w:w="70"/>
-              <w:right w:type="dxa" w:w="90"/>
-            </w:tcMar>
-            <w:vAlign w:val="center"/>
-          </w:tcPr>
-          <w:p>
-            <w:pPr>
-              <w:spacing w:after="0" w:before="0"/>
-            </w:pPr>
-            <w:r>
-              <w:rPr>
-                <w:b w:val="false"/>
-                <w:bCs w:val="false"/>
-                <w:color w:val="202B36"/>
-                <w:sz w:val="14"/>
-                <w:szCs w:val="14"/>
-              </w:rPr>
-              <w:t xml:space="preserve">linear amplitude ratios 0.87/0.79 and 0.85/0.76 vs matched ΛCDM</w:t>
-            </w:r>
-          </w:p>
-        </w:tc>
-        <w:tc>
-          <w:tcPr>
-            <w:tcW w:type="dxa" w:w="2600"/>
-            <w:tcBorders>
-              <w:top w:val="single" w:color="A8B3C2" w:sz="2"/>
-              <w:left w:val="single" w:color="A8B3C2" w:sz="2"/>
-              <w:bottom w:val="single" w:color="A8B3C2" w:sz="2"/>
-              <w:right w:val="single" w:color="A8B3C2" w:sz="2"/>
-            </w:tcBorders>
-            <w:shd w:fill="FFFFFF" w:val="clear"/>
-            <w:tcMar>
-              <w:top w:type="dxa" w:w="70"/>
-              <w:left w:type="dxa" w:w="90"/>
-              <w:bottom w:type="dxa" w:w="70"/>
-              <w:right w:type="dxa" w:w="90"/>
-            </w:tcMar>
-            <w:vAlign w:val="center"/>
-          </w:tcPr>
-          <w:p>
-            <w:pPr>
-              <w:spacing w:after="0" w:before="0"/>
-            </w:pPr>
-            <w:r>
-              <w:rPr>
-                <w:b w:val="false"/>
-                <w:bCs w:val="false"/>
-                <w:color w:val="202B36"/>
-                <w:sz w:val="14"/>
-                <w:szCs w:val="14"/>
-              </w:rPr>
-              <w:t xml:space="preserve">FALSIFIABLE PREDICTION; NATIVE LIKELIHOOD OPEN</w:t>
-            </w:r>
-          </w:p>
-        </w:tc>
-      </w:tr>
     </w:tbl>
     <w:p>
       <w:pPr>
@@ -7764,7 +6178,7 @@
         <w:jc w:val="both"/>
       </w:pPr>
       <w:r>
-        <w:t xml:space="preserve">Code, data-download instructions, results, chains, and the pre-registered hypothesis chain: https://github.com/GrobeStreet/de-stress-lab (MIT). A human clean-room execution of the July DDM gate remains pending.</w:t>
+        <w:t xml:space="preserve">Code, data-download instructions, results, chains, and the pre-registered hypothesis chain: https://github.com/GrobeStreet/de-stress-lab (v1.0, MIT). Archived with DOI via Zenodo.</w:t>
       </w:r>
     </w:p>
     <w:sectPr>

</xml_diff>

<commit_message>
Prepare verified arXiv review package
</commit_message>
<xml_diff>
--- a/whitepaper.docx
+++ b/whitepaper.docx
@@ -1193,6 +1193,15 @@
         <w:jc w:val="both"/>
       </w:pPr>
       <w:r>
+        <w:t xml:space="preserve">After this analysis was frozen, Kim, Mota, and Tamosiunas independently studied the DR1-to-DR2 sequence with an anytime-valid e-process at a Planck-fixed background. Under their pre-specified alternative the running evidence crosses their illustrative threshold, but it does not survive when any of the seven bins is allowed to have produced the excess; removing LRG2 reduces their running e-value from 33.97 to 0.49. Their statistic, null, background treatment, and repeated-release question differ from the fitted-null bootstrap used here, so the numerical results must not be combined or treated as mutual validation. The qualitative agreement is narrower: LRG2 sensitivity and test specification are central. Their work also identifies a sequential-testing question across releases that the present single-release calibration does not answer.</w:t>
+      </w:r>
+    </w:p>
+    <w:p>
+      <w:pPr>
+        <w:widowControl/>
+        <w:jc w:val="both"/>
+      </w:pPr>
+      <w:r>
         <w:t xml:space="preserve">A targeted held-out check fits ΛCDM to DESI+cCMB without LRG2, propagates the fitted-parameter covariance, and then predicts the excluded (D_M/r_d, D_H/r_d) vector. The prediction is (17.530, 20.066), compared with (17.351, 19.455) observed. Repeating the full exclusion, fit, prediction, and score in 5,000 fitted-ΛCDM mocks gives a joint tail of 204/5,000, p = 0.0408 [0.0355, 0.0467] (2.05σ). Its decomposition changes the earlier interpretation: the isotropic distance D_V/r_d is low (p = 0.0204), but the Alcock–Paczynski ratio D_M/D_H is unexceptional (p = 0.374). LRG2's radial coordinate carries more leverage for the w₀wₐ model comparison, but the held-out residual is not an anomalous anisotropy. Because LRG2 was selected after inspection, these targeted p-values are diagnostic and do not replace the selected-null calibration above. Shifting LRG2 halfway toward ΛCDM lowers the global preference below 2σ; inflating only its errors degrades the signal smoothly, indicating statistical leverage rather than numerical pathology. On the supernova side, the significance of DESI+Pantheon+ falls monotonically from 1.8σ to 1.3σ as low-z cuts rise from z &gt; 0.01 to z &gt; 0.1, with w₀ pinned near −0.89 throughout.</w:t>
       </w:r>
     </w:p>
@@ -2416,6 +2425,18 @@
       </w:pPr>
       <w:r>
         <w:t xml:space="preserve">Cortês and Liddle, “Interpreting DESI’s evidence for evolving dark energy,” arXiv:2504.15336.</w:t>
+      </w:r>
+    </w:p>
+    <w:p>
+      <w:pPr>
+        <w:pStyle w:val="ListParagraph"/>
+        <w:numPr>
+          <w:ilvl w:val="0"/>
+          <w:numId w:val="2"/>
+        </w:numPr>
+      </w:pPr>
+      <w:r>
+        <w:t xml:space="preserve">Kim, Mota, and Tamosiunas, “A Sequentially-Valid Reanalysis of DESI's Dynamical Dark Energy Signal,” arXiv:2607.28918.</w:t>
       </w:r>
     </w:p>
     <w:p>

</xml_diff>

<commit_message>
Prepare verified arXiv review package (#24)
* Prepare verified arXiv review package

* Resolve arXiv identity and license metadata

* Record verified arXiv account state

* Harden arXiv handoff metadata against current submission rules

* Make arXiv machine metadata paste-safe and author-gated

---------

Co-authored-by: Bobby Morong <bobby@datadunknba.com>
</commit_message>
<xml_diff>
--- a/whitepaper.docx
+++ b/whitepaper.docx
@@ -46,7 +46,7 @@
           <w:sz w:val="21"/>
           <w:szCs w:val="21"/>
         </w:rPr>
-        <w:t xml:space="preserve">Bobby Morong (independent researcher), with AI-assisted implementation · July 2026</w:t>
+        <w:t xml:space="preserve">Robert Morong (independent researcher, San Diego, California, USA), with AI-assisted implementation · July 2026</w:t>
       </w:r>
     </w:p>
     <w:p>
@@ -1193,6 +1193,15 @@
         <w:jc w:val="both"/>
       </w:pPr>
       <w:r>
+        <w:t xml:space="preserve">After this analysis was frozen, Kim, Mota, and Tamosiunas independently studied the DR1-to-DR2 sequence with an anytime-valid e-process at a Planck-fixed background. Under their pre-specified alternative the running evidence crosses their illustrative threshold, but it does not survive when any of the seven bins is allowed to have produced the excess; removing LRG2 reduces their running e-value from 33.97 to 0.49. Their statistic, null, background treatment, and repeated-release question differ from the fitted-null bootstrap used here, so the numerical results must not be combined or treated as mutual validation. The qualitative agreement is narrower: LRG2 sensitivity and test specification are central. Their work also identifies a sequential-testing question across releases that the present single-release calibration does not answer.</w:t>
+      </w:r>
+    </w:p>
+    <w:p>
+      <w:pPr>
+        <w:widowControl/>
+        <w:jc w:val="both"/>
+      </w:pPr>
+      <w:r>
         <w:t xml:space="preserve">A targeted held-out check fits ΛCDM to DESI+cCMB without LRG2, propagates the fitted-parameter covariance, and then predicts the excluded (D_M/r_d, D_H/r_d) vector. The prediction is (17.530, 20.066), compared with (17.351, 19.455) observed. Repeating the full exclusion, fit, prediction, and score in 5,000 fitted-ΛCDM mocks gives a joint tail of 204/5,000, p = 0.0408 [0.0355, 0.0467] (2.05σ). Its decomposition changes the earlier interpretation: the isotropic distance D_V/r_d is low (p = 0.0204), but the Alcock–Paczynski ratio D_M/D_H is unexceptional (p = 0.374). LRG2's radial coordinate carries more leverage for the w₀wₐ model comparison, but the held-out residual is not an anomalous anisotropy. Because LRG2 was selected after inspection, these targeted p-values are diagnostic and do not replace the selected-null calibration above. Shifting LRG2 halfway toward ΛCDM lowers the global preference below 2σ; inflating only its errors degrades the signal smoothly, indicating statistical leverage rather than numerical pathology. On the supernova side, the significance of DESI+Pantheon+ falls monotonically from 1.8σ to 1.3σ as low-z cuts rise from z &gt; 0.01 to z &gt; 0.1, with w₀ pinned near −0.89 throughout.</w:t>
       </w:r>
     </w:p>
@@ -2416,6 +2425,18 @@
       </w:pPr>
       <w:r>
         <w:t xml:space="preserve">Cortês and Liddle, “Interpreting DESI’s evidence for evolving dark energy,” arXiv:2504.15336.</w:t>
+      </w:r>
+    </w:p>
+    <w:p>
+      <w:pPr>
+        <w:pStyle w:val="ListParagraph"/>
+        <w:numPr>
+          <w:ilvl w:val="0"/>
+          <w:numId w:val="2"/>
+        </w:numPr>
+      </w:pPr>
+      <w:r>
+        <w:t xml:space="preserve">Kim, Mota, and Tamosiunas, “A Sequentially-Valid Reanalysis of DESI's Dynamical Dark Energy Signal,” arXiv:2607.28918.</w:t>
       </w:r>
     </w:p>
     <w:p>

</xml_diff>